<commit_message>
Set project book file structure appendix to left-to-right
</commit_message>
<xml_diff>
--- a/output/ספר פרויקט גמר - Smart Sales - גרסה סופית.docx
+++ b/output/ספר פרויקט גמר - Smart Sales - גרסה סופית.docx
@@ -1,6 +1,6 @@
 
 <file path=word/document.xml><?xml version="1.0" encoding="utf-8"?>
-<w:document xmlns:wpc="http://schemas.microsoft.com/office/word/2010/wordprocessingCanvas" xmlns:cx="http://schemas.microsoft.com/office/drawing/2014/chartex" xmlns:cx1="http://schemas.microsoft.com/office/drawing/2015/9/8/chartex" xmlns:cx2="http://schemas.microsoft.com/office/drawing/2015/10/21/chartex" xmlns:cx3="http://schemas.microsoft.com/office/drawing/2016/5/9/chartex" xmlns:cx4="http://schemas.microsoft.com/office/drawing/2016/5/10/chartex" xmlns:cx5="http://schemas.microsoft.com/office/drawing/2016/5/11/chartex" xmlns:cx6="http://schemas.microsoft.com/office/drawing/2016/5/12/chartex" xmlns:cx7="http://schemas.microsoft.com/office/drawing/2016/5/13/chartex" xmlns:cx8="http://schemas.microsoft.com/office/drawing/2016/5/14/chartex" xmlns:mc="http://schemas.openxmlformats.org/markup-compatibility/2006" xmlns:aink="http://schemas.microsoft.com/office/drawing/2016/ink" xmlns:am3d="http://schemas.microsoft.com/office/drawing/2017/model3d" xmlns:o="urn:schemas-microsoft-com:office:office" xmlns:oel="http://schemas.microsoft.com/office/2019/extlst" xmlns:r="http://schemas.openxmlformats.org/officeDocument/2006/relationships" xmlns:m="http://schemas.openxmlformats.org/officeDocument/2006/math" xmlns:v="urn:schemas-microsoft-com:vml" xmlns:wp14="http://schemas.microsoft.com/office/word/2010/wordprocessingDrawing" xmlns:wp="http://schemas.openxmlformats.org/drawingml/2006/wordprocessingDrawing" xmlns:w10="urn:schemas-microsoft-com:office:word" xmlns:w="http://schemas.openxmlformats.org/wordprocessingml/2006/main" xmlns:w14="http://schemas.microsoft.com/office/word/2010/wordml" xmlns:w15="http://schemas.microsoft.com/office/word/2012/wordml" xmlns:w16cex="http://schemas.microsoft.com/office/word/2018/wordml/cex" xmlns:w16cid="http://schemas.microsoft.com/office/word/2016/wordml/cid" xmlns:w16="http://schemas.microsoft.com/office/word/2018/wordml" xmlns:w16du="http://schemas.microsoft.com/office/word/2023/wordml/word16du" xmlns:w16sdtdh="http://schemas.microsoft.com/office/word/2020/wordml/sdtdatahash" xmlns:w16sdtfl="http://schemas.microsoft.com/office/word/2024/wordml/sdtformatlock" xmlns:w16se="http://schemas.microsoft.com/office/word/2015/wordml/symex" xmlns:wpg="http://schemas.microsoft.com/office/word/2010/wordprocessingGroup" xmlns:wpi="http://schemas.microsoft.com/office/word/2010/wordprocessingInk" xmlns:wne="http://schemas.microsoft.com/office/word/2006/wordml" xmlns:wps="http://schemas.microsoft.com/office/word/2010/wordprocessingShape" mc:Ignorable="w14 w15 w16se w16cid w16 w16cex w16sdtdh w16sdtfl w16du wp14">
+<w:document xmlns:wpc="http://schemas.microsoft.com/office/word/2010/wordprocessingCanvas" xmlns:cx="http://schemas.microsoft.com/office/drawing/2014/chartex" xmlns:cx1="http://schemas.microsoft.com/office/drawing/2015/9/8/chartex" xmlns:cx2="http://schemas.microsoft.com/office/drawing/2015/10/21/chartex" xmlns:cx3="http://schemas.microsoft.com/office/drawing/2016/5/9/chartex" xmlns:cx4="http://schemas.microsoft.com/office/drawing/2016/5/10/chartex" xmlns:cx5="http://schemas.microsoft.com/office/drawing/2016/5/11/chartex" xmlns:cx6="http://schemas.microsoft.com/office/drawing/2016/5/12/chartex" xmlns:cx7="http://schemas.microsoft.com/office/drawing/2016/5/13/chartex" xmlns:cx8="http://schemas.microsoft.com/office/drawing/2016/5/14/chartex" xmlns:mc="http://schemas.openxmlformats.org/markup-compatibility/2006" xmlns:m="http://schemas.openxmlformats.org/officeDocument/2006/math" xmlns:aink="http://schemas.microsoft.com/office/drawing/2016/ink" xmlns:am3d="http://schemas.microsoft.com/office/drawing/2017/model3d" xmlns:oel="http://schemas.microsoft.com/office/2019/extlst" xmlns:r="http://schemas.openxmlformats.org/officeDocument/2006/relationships" xmlns:wp14="http://schemas.microsoft.com/office/word/2010/wordprocessingDrawing" xmlns:wp="http://schemas.openxmlformats.org/drawingml/2006/wordprocessingDrawing" xmlns:wpg="http://schemas.microsoft.com/office/word/2010/wordprocessingGroup" xmlns:wpi="http://schemas.microsoft.com/office/word/2010/wordprocessingInk" xmlns:wps="http://schemas.microsoft.com/office/word/2010/wordprocessingShape" xmlns:o="urn:schemas-microsoft-com:office:office" xmlns:v="urn:schemas-microsoft-com:vml" xmlns:w10="urn:schemas-microsoft-com:office:word" xmlns:w="http://schemas.openxmlformats.org/wordprocessingml/2006/main" xmlns:w14="http://schemas.microsoft.com/office/word/2010/wordml" xmlns:w15="http://schemas.microsoft.com/office/word/2012/wordml" xmlns:w16cex="http://schemas.microsoft.com/office/word/2018/wordml/cex" xmlns:w16cid="http://schemas.microsoft.com/office/word/2016/wordml/cid" xmlns:w16="http://schemas.microsoft.com/office/word/2018/wordml" xmlns:w16sdtdh="http://schemas.microsoft.com/office/word/2020/wordml/sdtdatahash" xmlns:w16sdtfl="http://schemas.microsoft.com/office/word/2024/wordml/sdtformatlock" xmlns:w16se="http://schemas.microsoft.com/office/word/2015/wordml/symex" xmlns:w16du="http://schemas.microsoft.com/office/word/2023/wordml/word16du" xmlns:wne="http://schemas.microsoft.com/office/word/2006/wordml" mc:Ignorable="w14 w15 w16se w16cid w16 w16cex w16sdtdh w16sdtfl w16du wp14">
   <w:body>
     <w:p>
       <w:pPr>
@@ -8607,7 +8607,7 @@
           <w:noProof/>
         </w:rPr>
         <w:drawing>
-          <wp:anchor distT="0" distB="0" distL="114300" distR="114300" simplePos="0" relativeHeight="251660288" behindDoc="1" locked="0" layoutInCell="1" allowOverlap="1" wp14:anchorId="206D17E8" wp14:editId="1A475E0B">
+          <wp:anchor distT="0" distB="0" distL="114300" distR="114300" simplePos="0" relativeHeight="251660288" behindDoc="1" locked="0" layoutInCell="1" allowOverlap="1" wp14:anchorId="206D17E8" wp14:editId="400DB1D9">
             <wp:simplePos x="0" y="0"/>
             <wp:positionH relativeFrom="column">
               <wp:posOffset>-17145</wp:posOffset>
@@ -8786,7 +8786,6 @@
         <w:pStyle w:val="2"/>
         <w:jc w:val="left"/>
         <w:rPr>
-          <w:rFonts w:hint="cs"/>
           <w:rtl/>
         </w:rPr>
       </w:pPr>
@@ -22037,6 +22036,7 @@
     <w:p>
       <w:pPr>
         <w:pStyle w:val="1"/>
+        <w:bidi w:val="0"/>
         <w:spacing w:before="0"/>
         <w:jc w:val="left"/>
       </w:pPr>
@@ -22053,6 +22053,9 @@
       <w:bookmarkEnd w:id="130"/>
     </w:p>
     <w:p>
+      <w:pPr>
+        <w:bidi w:val="0"/>
+      </w:pPr>
       <w:r>
         <w:t>‎backend/app/main.py‎</w:t>
       </w:r>
@@ -22087,6 +22090,9 @@
       </w:r>
     </w:p>
     <w:p>
+      <w:pPr>
+        <w:bidi w:val="0"/>
+      </w:pPr>
       <w:r>
         <w:t>‎backend/app/</w:t>
       </w:r>
@@ -22126,6 +22132,9 @@
       </w:r>
     </w:p>
     <w:p>
+      <w:pPr>
+        <w:bidi w:val="0"/>
+      </w:pPr>
       <w:r>
         <w:t>‎backend/app/services‎</w:t>
       </w:r>
@@ -22137,6 +22146,9 @@
       </w:r>
     </w:p>
     <w:p>
+      <w:pPr>
+        <w:bidi w:val="0"/>
+      </w:pPr>
       <w:r>
         <w:t>‎backend/app/schemas‎</w:t>
       </w:r>
@@ -22159,6 +22171,9 @@
       </w:r>
     </w:p>
     <w:p>
+      <w:pPr>
+        <w:bidi w:val="0"/>
+      </w:pPr>
       <w:r>
         <w:t>‎backend/app/core‎</w:t>
       </w:r>
@@ -22170,6 +22185,9 @@
       </w:r>
     </w:p>
     <w:p>
+      <w:pPr>
+        <w:bidi w:val="0"/>
+      </w:pPr>
       <w:r>
         <w:t>‎backend/app/</w:t>
       </w:r>
@@ -22200,6 +22218,9 @@
       </w:r>
     </w:p>
     <w:p>
+      <w:pPr>
+        <w:bidi w:val="0"/>
+      </w:pPr>
       <w:r>
         <w:t>‎backend/</w:t>
       </w:r>
@@ -22219,6 +22240,9 @@
       </w:r>
     </w:p>
     <w:p>
+      <w:pPr>
+        <w:bidi w:val="0"/>
+      </w:pPr>
       <w:r>
         <w:t>‎frontend/</w:t>
       </w:r>
@@ -22246,6 +22270,9 @@
       </w:r>
     </w:p>
     <w:p>
+      <w:pPr>
+        <w:bidi w:val="0"/>
+      </w:pPr>
       <w:r>
         <w:t>‎frontend/</w:t>
       </w:r>
@@ -22282,6 +22309,9 @@
       </w:r>
     </w:p>
     <w:p>
+      <w:pPr>
+        <w:bidi w:val="0"/>
+      </w:pPr>
       <w:r>
         <w:t>‎frontend/</w:t>
       </w:r>
@@ -22301,6 +22331,9 @@
       </w:r>
     </w:p>
     <w:p>
+      <w:pPr>
+        <w:bidi w:val="0"/>
+      </w:pPr>
       <w:r>
         <w:t>‎frontend/</w:t>
       </w:r>
@@ -27390,7 +27423,7 @@
 </file>
 
 <file path=word/endnotes.xml><?xml version="1.0" encoding="utf-8"?>
-<w:endnotes xmlns:wpc="http://schemas.microsoft.com/office/word/2010/wordprocessingCanvas" xmlns:cx="http://schemas.microsoft.com/office/drawing/2014/chartex" xmlns:cx1="http://schemas.microsoft.com/office/drawing/2015/9/8/chartex" xmlns:cx2="http://schemas.microsoft.com/office/drawing/2015/10/21/chartex" xmlns:cx3="http://schemas.microsoft.com/office/drawing/2016/5/9/chartex" xmlns:cx4="http://schemas.microsoft.com/office/drawing/2016/5/10/chartex" xmlns:cx5="http://schemas.microsoft.com/office/drawing/2016/5/11/chartex" xmlns:cx6="http://schemas.microsoft.com/office/drawing/2016/5/12/chartex" xmlns:cx7="http://schemas.microsoft.com/office/drawing/2016/5/13/chartex" xmlns:cx8="http://schemas.microsoft.com/office/drawing/2016/5/14/chartex" xmlns:mc="http://schemas.openxmlformats.org/markup-compatibility/2006" xmlns:aink="http://schemas.microsoft.com/office/drawing/2016/ink" xmlns:am3d="http://schemas.microsoft.com/office/drawing/2017/model3d" xmlns:o="urn:schemas-microsoft-com:office:office" xmlns:oel="http://schemas.microsoft.com/office/2019/extlst" xmlns:r="http://schemas.openxmlformats.org/officeDocument/2006/relationships" xmlns:m="http://schemas.openxmlformats.org/officeDocument/2006/math" xmlns:v="urn:schemas-microsoft-com:vml" xmlns:wp14="http://schemas.microsoft.com/office/word/2010/wordprocessingDrawing" xmlns:wp="http://schemas.openxmlformats.org/drawingml/2006/wordprocessingDrawing" xmlns:w10="urn:schemas-microsoft-com:office:word" xmlns:w="http://schemas.openxmlformats.org/wordprocessingml/2006/main" xmlns:w14="http://schemas.microsoft.com/office/word/2010/wordml" xmlns:w15="http://schemas.microsoft.com/office/word/2012/wordml" xmlns:w16cex="http://schemas.microsoft.com/office/word/2018/wordml/cex" xmlns:w16cid="http://schemas.microsoft.com/office/word/2016/wordml/cid" xmlns:w16="http://schemas.microsoft.com/office/word/2018/wordml" xmlns:w16du="http://schemas.microsoft.com/office/word/2023/wordml/word16du" xmlns:w16sdtdh="http://schemas.microsoft.com/office/word/2020/wordml/sdtdatahash" xmlns:w16sdtfl="http://schemas.microsoft.com/office/word/2024/wordml/sdtformatlock" xmlns:w16se="http://schemas.microsoft.com/office/word/2015/wordml/symex" xmlns:wpg="http://schemas.microsoft.com/office/word/2010/wordprocessingGroup" xmlns:wpi="http://schemas.microsoft.com/office/word/2010/wordprocessingInk" xmlns:wne="http://schemas.microsoft.com/office/word/2006/wordml" xmlns:wps="http://schemas.microsoft.com/office/word/2010/wordprocessingShape" mc:Ignorable="w14 w15 w16se w16cid w16 w16cex w16sdtdh w16sdtfl w16du wp14">
+<w:endnotes xmlns:wpc="http://schemas.microsoft.com/office/word/2010/wordprocessingCanvas" xmlns:cx="http://schemas.microsoft.com/office/drawing/2014/chartex" xmlns:cx1="http://schemas.microsoft.com/office/drawing/2015/9/8/chartex" xmlns:cx2="http://schemas.microsoft.com/office/drawing/2015/10/21/chartex" xmlns:cx3="http://schemas.microsoft.com/office/drawing/2016/5/9/chartex" xmlns:cx4="http://schemas.microsoft.com/office/drawing/2016/5/10/chartex" xmlns:cx5="http://schemas.microsoft.com/office/drawing/2016/5/11/chartex" xmlns:cx6="http://schemas.microsoft.com/office/drawing/2016/5/12/chartex" xmlns:cx7="http://schemas.microsoft.com/office/drawing/2016/5/13/chartex" xmlns:cx8="http://schemas.microsoft.com/office/drawing/2016/5/14/chartex" xmlns:mc="http://schemas.openxmlformats.org/markup-compatibility/2006" xmlns:m="http://schemas.openxmlformats.org/officeDocument/2006/math" xmlns:aink="http://schemas.microsoft.com/office/drawing/2016/ink" xmlns:am3d="http://schemas.microsoft.com/office/drawing/2017/model3d" xmlns:oel="http://schemas.microsoft.com/office/2019/extlst" xmlns:r="http://schemas.openxmlformats.org/officeDocument/2006/relationships" xmlns:wp14="http://schemas.microsoft.com/office/word/2010/wordprocessingDrawing" xmlns:wp="http://schemas.openxmlformats.org/drawingml/2006/wordprocessingDrawing" xmlns:wpg="http://schemas.microsoft.com/office/word/2010/wordprocessingGroup" xmlns:wpi="http://schemas.microsoft.com/office/word/2010/wordprocessingInk" xmlns:wps="http://schemas.microsoft.com/office/word/2010/wordprocessingShape" xmlns:o="urn:schemas-microsoft-com:office:office" xmlns:v="urn:schemas-microsoft-com:vml" xmlns:w10="urn:schemas-microsoft-com:office:word" xmlns:w="http://schemas.openxmlformats.org/wordprocessingml/2006/main" xmlns:w14="http://schemas.microsoft.com/office/word/2010/wordml" xmlns:w15="http://schemas.microsoft.com/office/word/2012/wordml" xmlns:w16cex="http://schemas.microsoft.com/office/word/2018/wordml/cex" xmlns:w16cid="http://schemas.microsoft.com/office/word/2016/wordml/cid" xmlns:w16="http://schemas.microsoft.com/office/word/2018/wordml" xmlns:w16sdtdh="http://schemas.microsoft.com/office/word/2020/wordml/sdtdatahash" xmlns:w16sdtfl="http://schemas.microsoft.com/office/word/2024/wordml/sdtformatlock" xmlns:w16se="http://schemas.microsoft.com/office/word/2015/wordml/symex" xmlns:w16du="http://schemas.microsoft.com/office/word/2023/wordml/word16du" xmlns:wne="http://schemas.microsoft.com/office/word/2006/wordml" mc:Ignorable="w14 w15 w16se w16cid w16 w16cex w16sdtdh w16sdtfl w16du wp14">
   <w:endnote w:type="separator" w:id="-1">
     <w:p>
       <w:pPr>
@@ -27415,7 +27448,7 @@
 </file>
 
 <file path=word/footer1.xml><?xml version="1.0" encoding="utf-8"?>
-<w:ftr xmlns:wpc="http://schemas.microsoft.com/office/word/2010/wordprocessingCanvas" xmlns:cx="http://schemas.microsoft.com/office/drawing/2014/chartex" xmlns:cx1="http://schemas.microsoft.com/office/drawing/2015/9/8/chartex" xmlns:cx2="http://schemas.microsoft.com/office/drawing/2015/10/21/chartex" xmlns:cx3="http://schemas.microsoft.com/office/drawing/2016/5/9/chartex" xmlns:cx4="http://schemas.microsoft.com/office/drawing/2016/5/10/chartex" xmlns:cx5="http://schemas.microsoft.com/office/drawing/2016/5/11/chartex" xmlns:cx6="http://schemas.microsoft.com/office/drawing/2016/5/12/chartex" xmlns:cx7="http://schemas.microsoft.com/office/drawing/2016/5/13/chartex" xmlns:cx8="http://schemas.microsoft.com/office/drawing/2016/5/14/chartex" xmlns:mc="http://schemas.openxmlformats.org/markup-compatibility/2006" xmlns:aink="http://schemas.microsoft.com/office/drawing/2016/ink" xmlns:am3d="http://schemas.microsoft.com/office/drawing/2017/model3d" xmlns:o="urn:schemas-microsoft-com:office:office" xmlns:oel="http://schemas.microsoft.com/office/2019/extlst" xmlns:r="http://schemas.openxmlformats.org/officeDocument/2006/relationships" xmlns:m="http://schemas.openxmlformats.org/officeDocument/2006/math" xmlns:v="urn:schemas-microsoft-com:vml" xmlns:wp14="http://schemas.microsoft.com/office/word/2010/wordprocessingDrawing" xmlns:wp="http://schemas.openxmlformats.org/drawingml/2006/wordprocessingDrawing" xmlns:w10="urn:schemas-microsoft-com:office:word" xmlns:w="http://schemas.openxmlformats.org/wordprocessingml/2006/main" xmlns:w14="http://schemas.microsoft.com/office/word/2010/wordml" xmlns:w15="http://schemas.microsoft.com/office/word/2012/wordml" xmlns:w16cex="http://schemas.microsoft.com/office/word/2018/wordml/cex" xmlns:w16cid="http://schemas.microsoft.com/office/word/2016/wordml/cid" xmlns:w16="http://schemas.microsoft.com/office/word/2018/wordml" xmlns:w16du="http://schemas.microsoft.com/office/word/2023/wordml/word16du" xmlns:w16sdtdh="http://schemas.microsoft.com/office/word/2020/wordml/sdtdatahash" xmlns:w16sdtfl="http://schemas.microsoft.com/office/word/2024/wordml/sdtformatlock" xmlns:w16se="http://schemas.microsoft.com/office/word/2015/wordml/symex" xmlns:wpg="http://schemas.microsoft.com/office/word/2010/wordprocessingGroup" xmlns:wpi="http://schemas.microsoft.com/office/word/2010/wordprocessingInk" xmlns:wne="http://schemas.microsoft.com/office/word/2006/wordml" xmlns:wps="http://schemas.microsoft.com/office/word/2010/wordprocessingShape" mc:Ignorable="w14 w15 w16se w16cid w16 w16cex w16sdtdh w16sdtfl w16du wp14">
+<w:ftr xmlns:wpc="http://schemas.microsoft.com/office/word/2010/wordprocessingCanvas" xmlns:cx="http://schemas.microsoft.com/office/drawing/2014/chartex" xmlns:cx1="http://schemas.microsoft.com/office/drawing/2015/9/8/chartex" xmlns:cx2="http://schemas.microsoft.com/office/drawing/2015/10/21/chartex" xmlns:cx3="http://schemas.microsoft.com/office/drawing/2016/5/9/chartex" xmlns:cx4="http://schemas.microsoft.com/office/drawing/2016/5/10/chartex" xmlns:cx5="http://schemas.microsoft.com/office/drawing/2016/5/11/chartex" xmlns:cx6="http://schemas.microsoft.com/office/drawing/2016/5/12/chartex" xmlns:cx7="http://schemas.microsoft.com/office/drawing/2016/5/13/chartex" xmlns:cx8="http://schemas.microsoft.com/office/drawing/2016/5/14/chartex" xmlns:mc="http://schemas.openxmlformats.org/markup-compatibility/2006" xmlns:m="http://schemas.openxmlformats.org/officeDocument/2006/math" xmlns:aink="http://schemas.microsoft.com/office/drawing/2016/ink" xmlns:am3d="http://schemas.microsoft.com/office/drawing/2017/model3d" xmlns:oel="http://schemas.microsoft.com/office/2019/extlst" xmlns:r="http://schemas.openxmlformats.org/officeDocument/2006/relationships" xmlns:wp14="http://schemas.microsoft.com/office/word/2010/wordprocessingDrawing" xmlns:wp="http://schemas.openxmlformats.org/drawingml/2006/wordprocessingDrawing" xmlns:wpg="http://schemas.microsoft.com/office/word/2010/wordprocessingGroup" xmlns:wpi="http://schemas.microsoft.com/office/word/2010/wordprocessingInk" xmlns:wps="http://schemas.microsoft.com/office/word/2010/wordprocessingShape" xmlns:o="urn:schemas-microsoft-com:office:office" xmlns:v="urn:schemas-microsoft-com:vml" xmlns:w10="urn:schemas-microsoft-com:office:word" xmlns:w="http://schemas.openxmlformats.org/wordprocessingml/2006/main" xmlns:w14="http://schemas.microsoft.com/office/word/2010/wordml" xmlns:w15="http://schemas.microsoft.com/office/word/2012/wordml" xmlns:w16cex="http://schemas.microsoft.com/office/word/2018/wordml/cex" xmlns:w16cid="http://schemas.microsoft.com/office/word/2016/wordml/cid" xmlns:w16="http://schemas.microsoft.com/office/word/2018/wordml" xmlns:w16sdtdh="http://schemas.microsoft.com/office/word/2020/wordml/sdtdatahash" xmlns:w16sdtfl="http://schemas.microsoft.com/office/word/2024/wordml/sdtformatlock" xmlns:w16se="http://schemas.microsoft.com/office/word/2015/wordml/symex" xmlns:w16du="http://schemas.microsoft.com/office/word/2023/wordml/word16du" xmlns:wne="http://schemas.microsoft.com/office/word/2006/wordml" mc:Ignorable="w14 w15 w16se w16cid w16 w16cex w16sdtdh w16sdtfl w16du wp14">
   <w:p>
     <w:pPr>
       <w:pStyle w:val="af"/>
@@ -27425,7 +27458,7 @@
 </file>
 
 <file path=word/footer2.xml><?xml version="1.0" encoding="utf-8"?>
-<w:ftr xmlns:wpc="http://schemas.microsoft.com/office/word/2010/wordprocessingCanvas" xmlns:cx="http://schemas.microsoft.com/office/drawing/2014/chartex" xmlns:cx1="http://schemas.microsoft.com/office/drawing/2015/9/8/chartex" xmlns:cx2="http://schemas.microsoft.com/office/drawing/2015/10/21/chartex" xmlns:cx3="http://schemas.microsoft.com/office/drawing/2016/5/9/chartex" xmlns:cx4="http://schemas.microsoft.com/office/drawing/2016/5/10/chartex" xmlns:cx5="http://schemas.microsoft.com/office/drawing/2016/5/11/chartex" xmlns:cx6="http://schemas.microsoft.com/office/drawing/2016/5/12/chartex" xmlns:cx7="http://schemas.microsoft.com/office/drawing/2016/5/13/chartex" xmlns:cx8="http://schemas.microsoft.com/office/drawing/2016/5/14/chartex" xmlns:mc="http://schemas.openxmlformats.org/markup-compatibility/2006" xmlns:aink="http://schemas.microsoft.com/office/drawing/2016/ink" xmlns:am3d="http://schemas.microsoft.com/office/drawing/2017/model3d" xmlns:o="urn:schemas-microsoft-com:office:office" xmlns:oel="http://schemas.microsoft.com/office/2019/extlst" xmlns:r="http://schemas.openxmlformats.org/officeDocument/2006/relationships" xmlns:m="http://schemas.openxmlformats.org/officeDocument/2006/math" xmlns:v="urn:schemas-microsoft-com:vml" xmlns:wp14="http://schemas.microsoft.com/office/word/2010/wordprocessingDrawing" xmlns:wp="http://schemas.openxmlformats.org/drawingml/2006/wordprocessingDrawing" xmlns:w10="urn:schemas-microsoft-com:office:word" xmlns:w="http://schemas.openxmlformats.org/wordprocessingml/2006/main" xmlns:w14="http://schemas.microsoft.com/office/word/2010/wordml" xmlns:w15="http://schemas.microsoft.com/office/word/2012/wordml" xmlns:w16cex="http://schemas.microsoft.com/office/word/2018/wordml/cex" xmlns:w16cid="http://schemas.microsoft.com/office/word/2016/wordml/cid" xmlns:w16="http://schemas.microsoft.com/office/word/2018/wordml" xmlns:w16du="http://schemas.microsoft.com/office/word/2023/wordml/word16du" xmlns:w16sdtdh="http://schemas.microsoft.com/office/word/2020/wordml/sdtdatahash" xmlns:w16sdtfl="http://schemas.microsoft.com/office/word/2024/wordml/sdtformatlock" xmlns:w16se="http://schemas.microsoft.com/office/word/2015/wordml/symex" xmlns:wpg="http://schemas.microsoft.com/office/word/2010/wordprocessingGroup" xmlns:wpi="http://schemas.microsoft.com/office/word/2010/wordprocessingInk" xmlns:wne="http://schemas.microsoft.com/office/word/2006/wordml" xmlns:wps="http://schemas.microsoft.com/office/word/2010/wordprocessingShape" mc:Ignorable="w14 w15 w16se w16cid w16 w16cex w16sdtdh w16sdtfl w16du wp14">
+<w:ftr xmlns:wpc="http://schemas.microsoft.com/office/word/2010/wordprocessingCanvas" xmlns:cx="http://schemas.microsoft.com/office/drawing/2014/chartex" xmlns:cx1="http://schemas.microsoft.com/office/drawing/2015/9/8/chartex" xmlns:cx2="http://schemas.microsoft.com/office/drawing/2015/10/21/chartex" xmlns:cx3="http://schemas.microsoft.com/office/drawing/2016/5/9/chartex" xmlns:cx4="http://schemas.microsoft.com/office/drawing/2016/5/10/chartex" xmlns:cx5="http://schemas.microsoft.com/office/drawing/2016/5/11/chartex" xmlns:cx6="http://schemas.microsoft.com/office/drawing/2016/5/12/chartex" xmlns:cx7="http://schemas.microsoft.com/office/drawing/2016/5/13/chartex" xmlns:cx8="http://schemas.microsoft.com/office/drawing/2016/5/14/chartex" xmlns:mc="http://schemas.openxmlformats.org/markup-compatibility/2006" xmlns:m="http://schemas.openxmlformats.org/officeDocument/2006/math" xmlns:aink="http://schemas.microsoft.com/office/drawing/2016/ink" xmlns:am3d="http://schemas.microsoft.com/office/drawing/2017/model3d" xmlns:oel="http://schemas.microsoft.com/office/2019/extlst" xmlns:r="http://schemas.openxmlformats.org/officeDocument/2006/relationships" xmlns:wp14="http://schemas.microsoft.com/office/word/2010/wordprocessingDrawing" xmlns:wp="http://schemas.openxmlformats.org/drawingml/2006/wordprocessingDrawing" xmlns:wpg="http://schemas.microsoft.com/office/word/2010/wordprocessingGroup" xmlns:wpi="http://schemas.microsoft.com/office/word/2010/wordprocessingInk" xmlns:wps="http://schemas.microsoft.com/office/word/2010/wordprocessingShape" xmlns:o="urn:schemas-microsoft-com:office:office" xmlns:v="urn:schemas-microsoft-com:vml" xmlns:w10="urn:schemas-microsoft-com:office:word" xmlns:w="http://schemas.openxmlformats.org/wordprocessingml/2006/main" xmlns:w14="http://schemas.microsoft.com/office/word/2010/wordml" xmlns:w15="http://schemas.microsoft.com/office/word/2012/wordml" xmlns:w16cex="http://schemas.microsoft.com/office/word/2018/wordml/cex" xmlns:w16cid="http://schemas.microsoft.com/office/word/2016/wordml/cid" xmlns:w16="http://schemas.microsoft.com/office/word/2018/wordml" xmlns:w16sdtdh="http://schemas.microsoft.com/office/word/2020/wordml/sdtdatahash" xmlns:w16sdtfl="http://schemas.microsoft.com/office/word/2024/wordml/sdtformatlock" xmlns:w16se="http://schemas.microsoft.com/office/word/2015/wordml/symex" xmlns:w16du="http://schemas.microsoft.com/office/word/2023/wordml/word16du" xmlns:wne="http://schemas.microsoft.com/office/word/2006/wordml" mc:Ignorable="w14 w15 w16se w16cid w16 w16cex w16sdtdh w16sdtfl w16du wp14">
   <w:p>
     <w:pPr>
       <w:jc w:val="center"/>
@@ -27500,7 +27533,7 @@
 </file>
 
 <file path=word/footer3.xml><?xml version="1.0" encoding="utf-8"?>
-<w:ftr xmlns:wpc="http://schemas.microsoft.com/office/word/2010/wordprocessingCanvas" xmlns:cx="http://schemas.microsoft.com/office/drawing/2014/chartex" xmlns:cx1="http://schemas.microsoft.com/office/drawing/2015/9/8/chartex" xmlns:cx2="http://schemas.microsoft.com/office/drawing/2015/10/21/chartex" xmlns:cx3="http://schemas.microsoft.com/office/drawing/2016/5/9/chartex" xmlns:cx4="http://schemas.microsoft.com/office/drawing/2016/5/10/chartex" xmlns:cx5="http://schemas.microsoft.com/office/drawing/2016/5/11/chartex" xmlns:cx6="http://schemas.microsoft.com/office/drawing/2016/5/12/chartex" xmlns:cx7="http://schemas.microsoft.com/office/drawing/2016/5/13/chartex" xmlns:cx8="http://schemas.microsoft.com/office/drawing/2016/5/14/chartex" xmlns:mc="http://schemas.openxmlformats.org/markup-compatibility/2006" xmlns:aink="http://schemas.microsoft.com/office/drawing/2016/ink" xmlns:am3d="http://schemas.microsoft.com/office/drawing/2017/model3d" xmlns:o="urn:schemas-microsoft-com:office:office" xmlns:oel="http://schemas.microsoft.com/office/2019/extlst" xmlns:r="http://schemas.openxmlformats.org/officeDocument/2006/relationships" xmlns:m="http://schemas.openxmlformats.org/officeDocument/2006/math" xmlns:v="urn:schemas-microsoft-com:vml" xmlns:wp14="http://schemas.microsoft.com/office/word/2010/wordprocessingDrawing" xmlns:wp="http://schemas.openxmlformats.org/drawingml/2006/wordprocessingDrawing" xmlns:w10="urn:schemas-microsoft-com:office:word" xmlns:w="http://schemas.openxmlformats.org/wordprocessingml/2006/main" xmlns:w14="http://schemas.microsoft.com/office/word/2010/wordml" xmlns:w15="http://schemas.microsoft.com/office/word/2012/wordml" xmlns:w16cex="http://schemas.microsoft.com/office/word/2018/wordml/cex" xmlns:w16cid="http://schemas.microsoft.com/office/word/2016/wordml/cid" xmlns:w16="http://schemas.microsoft.com/office/word/2018/wordml" xmlns:w16du="http://schemas.microsoft.com/office/word/2023/wordml/word16du" xmlns:w16sdtdh="http://schemas.microsoft.com/office/word/2020/wordml/sdtdatahash" xmlns:w16sdtfl="http://schemas.microsoft.com/office/word/2024/wordml/sdtformatlock" xmlns:w16se="http://schemas.microsoft.com/office/word/2015/wordml/symex" xmlns:wpg="http://schemas.microsoft.com/office/word/2010/wordprocessingGroup" xmlns:wpi="http://schemas.microsoft.com/office/word/2010/wordprocessingInk" xmlns:wne="http://schemas.microsoft.com/office/word/2006/wordml" xmlns:wps="http://schemas.microsoft.com/office/word/2010/wordprocessingShape" mc:Ignorable="w14 w15 w16se w16cid w16 w16cex w16sdtdh w16sdtfl w16du wp14">
+<w:ftr xmlns:wpc="http://schemas.microsoft.com/office/word/2010/wordprocessingCanvas" xmlns:cx="http://schemas.microsoft.com/office/drawing/2014/chartex" xmlns:cx1="http://schemas.microsoft.com/office/drawing/2015/9/8/chartex" xmlns:cx2="http://schemas.microsoft.com/office/drawing/2015/10/21/chartex" xmlns:cx3="http://schemas.microsoft.com/office/drawing/2016/5/9/chartex" xmlns:cx4="http://schemas.microsoft.com/office/drawing/2016/5/10/chartex" xmlns:cx5="http://schemas.microsoft.com/office/drawing/2016/5/11/chartex" xmlns:cx6="http://schemas.microsoft.com/office/drawing/2016/5/12/chartex" xmlns:cx7="http://schemas.microsoft.com/office/drawing/2016/5/13/chartex" xmlns:cx8="http://schemas.microsoft.com/office/drawing/2016/5/14/chartex" xmlns:mc="http://schemas.openxmlformats.org/markup-compatibility/2006" xmlns:m="http://schemas.openxmlformats.org/officeDocument/2006/math" xmlns:aink="http://schemas.microsoft.com/office/drawing/2016/ink" xmlns:am3d="http://schemas.microsoft.com/office/drawing/2017/model3d" xmlns:oel="http://schemas.microsoft.com/office/2019/extlst" xmlns:r="http://schemas.openxmlformats.org/officeDocument/2006/relationships" xmlns:wp14="http://schemas.microsoft.com/office/word/2010/wordprocessingDrawing" xmlns:wp="http://schemas.openxmlformats.org/drawingml/2006/wordprocessingDrawing" xmlns:wpg="http://schemas.microsoft.com/office/word/2010/wordprocessingGroup" xmlns:wpi="http://schemas.microsoft.com/office/word/2010/wordprocessingInk" xmlns:wps="http://schemas.microsoft.com/office/word/2010/wordprocessingShape" xmlns:o="urn:schemas-microsoft-com:office:office" xmlns:v="urn:schemas-microsoft-com:vml" xmlns:w10="urn:schemas-microsoft-com:office:word" xmlns:w="http://schemas.openxmlformats.org/wordprocessingml/2006/main" xmlns:w14="http://schemas.microsoft.com/office/word/2010/wordml" xmlns:w15="http://schemas.microsoft.com/office/word/2012/wordml" xmlns:w16cex="http://schemas.microsoft.com/office/word/2018/wordml/cex" xmlns:w16cid="http://schemas.microsoft.com/office/word/2016/wordml/cid" xmlns:w16="http://schemas.microsoft.com/office/word/2018/wordml" xmlns:w16sdtdh="http://schemas.microsoft.com/office/word/2020/wordml/sdtdatahash" xmlns:w16sdtfl="http://schemas.microsoft.com/office/word/2024/wordml/sdtformatlock" xmlns:w16se="http://schemas.microsoft.com/office/word/2015/wordml/symex" xmlns:w16du="http://schemas.microsoft.com/office/word/2023/wordml/word16du" xmlns:wne="http://schemas.microsoft.com/office/word/2006/wordml" mc:Ignorable="w14 w15 w16se w16cid w16 w16cex w16sdtdh w16sdtfl w16du wp14">
   <w:p>
     <w:pPr>
       <w:jc w:val="center"/>
@@ -27575,7 +27608,7 @@
 </file>
 
 <file path=word/footer4.xml><?xml version="1.0" encoding="utf-8"?>
-<w:ftr xmlns:wpc="http://schemas.microsoft.com/office/word/2010/wordprocessingCanvas" xmlns:cx="http://schemas.microsoft.com/office/drawing/2014/chartex" xmlns:cx1="http://schemas.microsoft.com/office/drawing/2015/9/8/chartex" xmlns:cx2="http://schemas.microsoft.com/office/drawing/2015/10/21/chartex" xmlns:cx3="http://schemas.microsoft.com/office/drawing/2016/5/9/chartex" xmlns:cx4="http://schemas.microsoft.com/office/drawing/2016/5/10/chartex" xmlns:cx5="http://schemas.microsoft.com/office/drawing/2016/5/11/chartex" xmlns:cx6="http://schemas.microsoft.com/office/drawing/2016/5/12/chartex" xmlns:cx7="http://schemas.microsoft.com/office/drawing/2016/5/13/chartex" xmlns:cx8="http://schemas.microsoft.com/office/drawing/2016/5/14/chartex" xmlns:mc="http://schemas.openxmlformats.org/markup-compatibility/2006" xmlns:aink="http://schemas.microsoft.com/office/drawing/2016/ink" xmlns:am3d="http://schemas.microsoft.com/office/drawing/2017/model3d" xmlns:o="urn:schemas-microsoft-com:office:office" xmlns:oel="http://schemas.microsoft.com/office/2019/extlst" xmlns:r="http://schemas.openxmlformats.org/officeDocument/2006/relationships" xmlns:m="http://schemas.openxmlformats.org/officeDocument/2006/math" xmlns:v="urn:schemas-microsoft-com:vml" xmlns:wp14="http://schemas.microsoft.com/office/word/2010/wordprocessingDrawing" xmlns:wp="http://schemas.openxmlformats.org/drawingml/2006/wordprocessingDrawing" xmlns:w10="urn:schemas-microsoft-com:office:word" xmlns:w="http://schemas.openxmlformats.org/wordprocessingml/2006/main" xmlns:w14="http://schemas.microsoft.com/office/word/2010/wordml" xmlns:w15="http://schemas.microsoft.com/office/word/2012/wordml" xmlns:w16cex="http://schemas.microsoft.com/office/word/2018/wordml/cex" xmlns:w16cid="http://schemas.microsoft.com/office/word/2016/wordml/cid" xmlns:w16="http://schemas.microsoft.com/office/word/2018/wordml" xmlns:w16du="http://schemas.microsoft.com/office/word/2023/wordml/word16du" xmlns:w16sdtdh="http://schemas.microsoft.com/office/word/2020/wordml/sdtdatahash" xmlns:w16sdtfl="http://schemas.microsoft.com/office/word/2024/wordml/sdtformatlock" xmlns:w16se="http://schemas.microsoft.com/office/word/2015/wordml/symex" xmlns:wpg="http://schemas.microsoft.com/office/word/2010/wordprocessingGroup" xmlns:wpi="http://schemas.microsoft.com/office/word/2010/wordprocessingInk" xmlns:wne="http://schemas.microsoft.com/office/word/2006/wordml" xmlns:wps="http://schemas.microsoft.com/office/word/2010/wordprocessingShape" mc:Ignorable="w14 w15 w16se w16cid w16 w16cex w16sdtdh w16sdtfl w16du wp14">
+<w:ftr xmlns:wpc="http://schemas.microsoft.com/office/word/2010/wordprocessingCanvas" xmlns:cx="http://schemas.microsoft.com/office/drawing/2014/chartex" xmlns:cx1="http://schemas.microsoft.com/office/drawing/2015/9/8/chartex" xmlns:cx2="http://schemas.microsoft.com/office/drawing/2015/10/21/chartex" xmlns:cx3="http://schemas.microsoft.com/office/drawing/2016/5/9/chartex" xmlns:cx4="http://schemas.microsoft.com/office/drawing/2016/5/10/chartex" xmlns:cx5="http://schemas.microsoft.com/office/drawing/2016/5/11/chartex" xmlns:cx6="http://schemas.microsoft.com/office/drawing/2016/5/12/chartex" xmlns:cx7="http://schemas.microsoft.com/office/drawing/2016/5/13/chartex" xmlns:cx8="http://schemas.microsoft.com/office/drawing/2016/5/14/chartex" xmlns:mc="http://schemas.openxmlformats.org/markup-compatibility/2006" xmlns:m="http://schemas.openxmlformats.org/officeDocument/2006/math" xmlns:aink="http://schemas.microsoft.com/office/drawing/2016/ink" xmlns:am3d="http://schemas.microsoft.com/office/drawing/2017/model3d" xmlns:oel="http://schemas.microsoft.com/office/2019/extlst" xmlns:r="http://schemas.openxmlformats.org/officeDocument/2006/relationships" xmlns:wp14="http://schemas.microsoft.com/office/word/2010/wordprocessingDrawing" xmlns:wp="http://schemas.openxmlformats.org/drawingml/2006/wordprocessingDrawing" xmlns:wpg="http://schemas.microsoft.com/office/word/2010/wordprocessingGroup" xmlns:wpi="http://schemas.microsoft.com/office/word/2010/wordprocessingInk" xmlns:wps="http://schemas.microsoft.com/office/word/2010/wordprocessingShape" xmlns:o="urn:schemas-microsoft-com:office:office" xmlns:v="urn:schemas-microsoft-com:vml" xmlns:w10="urn:schemas-microsoft-com:office:word" xmlns:w="http://schemas.openxmlformats.org/wordprocessingml/2006/main" xmlns:w14="http://schemas.microsoft.com/office/word/2010/wordml" xmlns:w15="http://schemas.microsoft.com/office/word/2012/wordml" xmlns:w16cex="http://schemas.microsoft.com/office/word/2018/wordml/cex" xmlns:w16cid="http://schemas.microsoft.com/office/word/2016/wordml/cid" xmlns:w16="http://schemas.microsoft.com/office/word/2018/wordml" xmlns:w16sdtdh="http://schemas.microsoft.com/office/word/2020/wordml/sdtdatahash" xmlns:w16sdtfl="http://schemas.microsoft.com/office/word/2024/wordml/sdtformatlock" xmlns:w16se="http://schemas.microsoft.com/office/word/2015/wordml/symex" xmlns:w16du="http://schemas.microsoft.com/office/word/2023/wordml/word16du" xmlns:wne="http://schemas.microsoft.com/office/word/2006/wordml" mc:Ignorable="w14 w15 w16se w16cid w16 w16cex w16sdtdh w16sdtfl w16du wp14">
   <w:p>
     <w:pPr>
       <w:jc w:val="center"/>
@@ -27650,13 +27683,13 @@
 </file>
 
 <file path=word/footer5.xml><?xml version="1.0" encoding="utf-8"?>
-<w:ftr xmlns:wpc="http://schemas.microsoft.com/office/word/2010/wordprocessingCanvas" xmlns:cx="http://schemas.microsoft.com/office/drawing/2014/chartex" xmlns:cx1="http://schemas.microsoft.com/office/drawing/2015/9/8/chartex" xmlns:cx2="http://schemas.microsoft.com/office/drawing/2015/10/21/chartex" xmlns:cx3="http://schemas.microsoft.com/office/drawing/2016/5/9/chartex" xmlns:cx4="http://schemas.microsoft.com/office/drawing/2016/5/10/chartex" xmlns:cx5="http://schemas.microsoft.com/office/drawing/2016/5/11/chartex" xmlns:cx6="http://schemas.microsoft.com/office/drawing/2016/5/12/chartex" xmlns:cx7="http://schemas.microsoft.com/office/drawing/2016/5/13/chartex" xmlns:cx8="http://schemas.microsoft.com/office/drawing/2016/5/14/chartex" xmlns:mc="http://schemas.openxmlformats.org/markup-compatibility/2006" xmlns:aink="http://schemas.microsoft.com/office/drawing/2016/ink" xmlns:am3d="http://schemas.microsoft.com/office/drawing/2017/model3d" xmlns:o="urn:schemas-microsoft-com:office:office" xmlns:oel="http://schemas.microsoft.com/office/2019/extlst" xmlns:r="http://schemas.openxmlformats.org/officeDocument/2006/relationships" xmlns:m="http://schemas.openxmlformats.org/officeDocument/2006/math" xmlns:v="urn:schemas-microsoft-com:vml" xmlns:wp14="http://schemas.microsoft.com/office/word/2010/wordprocessingDrawing" xmlns:wp="http://schemas.openxmlformats.org/drawingml/2006/wordprocessingDrawing" xmlns:w10="urn:schemas-microsoft-com:office:word" xmlns:w="http://schemas.openxmlformats.org/wordprocessingml/2006/main" xmlns:w14="http://schemas.microsoft.com/office/word/2010/wordml" xmlns:w15="http://schemas.microsoft.com/office/word/2012/wordml" xmlns:w16cex="http://schemas.microsoft.com/office/word/2018/wordml/cex" xmlns:w16cid="http://schemas.microsoft.com/office/word/2016/wordml/cid" xmlns:w16="http://schemas.microsoft.com/office/word/2018/wordml" xmlns:w16du="http://schemas.microsoft.com/office/word/2023/wordml/word16du" xmlns:w16sdtdh="http://schemas.microsoft.com/office/word/2020/wordml/sdtdatahash" xmlns:w16sdtfl="http://schemas.microsoft.com/office/word/2024/wordml/sdtformatlock" xmlns:w16se="http://schemas.microsoft.com/office/word/2015/wordml/symex" xmlns:wpg="http://schemas.microsoft.com/office/word/2010/wordprocessingGroup" xmlns:wpi="http://schemas.microsoft.com/office/word/2010/wordprocessingInk" xmlns:wne="http://schemas.microsoft.com/office/word/2006/wordml" xmlns:wps="http://schemas.microsoft.com/office/word/2010/wordprocessingShape" mc:Ignorable="w14 w15 w16se w16cid w16 w16cex w16sdtdh w16sdtfl w16du wp14">
+<w:ftr xmlns:wpc="http://schemas.microsoft.com/office/word/2010/wordprocessingCanvas" xmlns:cx="http://schemas.microsoft.com/office/drawing/2014/chartex" xmlns:cx1="http://schemas.microsoft.com/office/drawing/2015/9/8/chartex" xmlns:cx2="http://schemas.microsoft.com/office/drawing/2015/10/21/chartex" xmlns:cx3="http://schemas.microsoft.com/office/drawing/2016/5/9/chartex" xmlns:cx4="http://schemas.microsoft.com/office/drawing/2016/5/10/chartex" xmlns:cx5="http://schemas.microsoft.com/office/drawing/2016/5/11/chartex" xmlns:cx6="http://schemas.microsoft.com/office/drawing/2016/5/12/chartex" xmlns:cx7="http://schemas.microsoft.com/office/drawing/2016/5/13/chartex" xmlns:cx8="http://schemas.microsoft.com/office/drawing/2016/5/14/chartex" xmlns:mc="http://schemas.openxmlformats.org/markup-compatibility/2006" xmlns:m="http://schemas.openxmlformats.org/officeDocument/2006/math" xmlns:aink="http://schemas.microsoft.com/office/drawing/2016/ink" xmlns:am3d="http://schemas.microsoft.com/office/drawing/2017/model3d" xmlns:oel="http://schemas.microsoft.com/office/2019/extlst" xmlns:r="http://schemas.openxmlformats.org/officeDocument/2006/relationships" xmlns:wp14="http://schemas.microsoft.com/office/word/2010/wordprocessingDrawing" xmlns:wp="http://schemas.openxmlformats.org/drawingml/2006/wordprocessingDrawing" xmlns:wpg="http://schemas.microsoft.com/office/word/2010/wordprocessingGroup" xmlns:wpi="http://schemas.microsoft.com/office/word/2010/wordprocessingInk" xmlns:wps="http://schemas.microsoft.com/office/word/2010/wordprocessingShape" xmlns:o="urn:schemas-microsoft-com:office:office" xmlns:v="urn:schemas-microsoft-com:vml" xmlns:w10="urn:schemas-microsoft-com:office:word" xmlns:w="http://schemas.openxmlformats.org/wordprocessingml/2006/main" xmlns:w14="http://schemas.microsoft.com/office/word/2010/wordml" xmlns:w15="http://schemas.microsoft.com/office/word/2012/wordml" xmlns:w16cex="http://schemas.microsoft.com/office/word/2018/wordml/cex" xmlns:w16cid="http://schemas.microsoft.com/office/word/2016/wordml/cid" xmlns:w16="http://schemas.microsoft.com/office/word/2018/wordml" xmlns:w16sdtdh="http://schemas.microsoft.com/office/word/2020/wordml/sdtdatahash" xmlns:w16sdtfl="http://schemas.microsoft.com/office/word/2024/wordml/sdtformatlock" xmlns:w16se="http://schemas.microsoft.com/office/word/2015/wordml/symex" xmlns:w16du="http://schemas.microsoft.com/office/word/2023/wordml/word16du" xmlns:wne="http://schemas.microsoft.com/office/word/2006/wordml" mc:Ignorable="w14 w15 w16se w16cid w16 w16cex w16sdtdh w16sdtfl w16du wp14">
   <w:p/>
 </w:ftr>
 </file>
 
 <file path=word/footer6.xml><?xml version="1.0" encoding="utf-8"?>
-<w:ftr xmlns:wpc="http://schemas.microsoft.com/office/word/2010/wordprocessingCanvas" xmlns:cx="http://schemas.microsoft.com/office/drawing/2014/chartex" xmlns:cx1="http://schemas.microsoft.com/office/drawing/2015/9/8/chartex" xmlns:cx2="http://schemas.microsoft.com/office/drawing/2015/10/21/chartex" xmlns:cx3="http://schemas.microsoft.com/office/drawing/2016/5/9/chartex" xmlns:cx4="http://schemas.microsoft.com/office/drawing/2016/5/10/chartex" xmlns:cx5="http://schemas.microsoft.com/office/drawing/2016/5/11/chartex" xmlns:cx6="http://schemas.microsoft.com/office/drawing/2016/5/12/chartex" xmlns:cx7="http://schemas.microsoft.com/office/drawing/2016/5/13/chartex" xmlns:cx8="http://schemas.microsoft.com/office/drawing/2016/5/14/chartex" xmlns:mc="http://schemas.openxmlformats.org/markup-compatibility/2006" xmlns:aink="http://schemas.microsoft.com/office/drawing/2016/ink" xmlns:am3d="http://schemas.microsoft.com/office/drawing/2017/model3d" xmlns:o="urn:schemas-microsoft-com:office:office" xmlns:oel="http://schemas.microsoft.com/office/2019/extlst" xmlns:r="http://schemas.openxmlformats.org/officeDocument/2006/relationships" xmlns:m="http://schemas.openxmlformats.org/officeDocument/2006/math" xmlns:v="urn:schemas-microsoft-com:vml" xmlns:wp14="http://schemas.microsoft.com/office/word/2010/wordprocessingDrawing" xmlns:wp="http://schemas.openxmlformats.org/drawingml/2006/wordprocessingDrawing" xmlns:w10="urn:schemas-microsoft-com:office:word" xmlns:w="http://schemas.openxmlformats.org/wordprocessingml/2006/main" xmlns:w14="http://schemas.microsoft.com/office/word/2010/wordml" xmlns:w15="http://schemas.microsoft.com/office/word/2012/wordml" xmlns:w16cex="http://schemas.microsoft.com/office/word/2018/wordml/cex" xmlns:w16cid="http://schemas.microsoft.com/office/word/2016/wordml/cid" xmlns:w16="http://schemas.microsoft.com/office/word/2018/wordml" xmlns:w16du="http://schemas.microsoft.com/office/word/2023/wordml/word16du" xmlns:w16sdtdh="http://schemas.microsoft.com/office/word/2020/wordml/sdtdatahash" xmlns:w16sdtfl="http://schemas.microsoft.com/office/word/2024/wordml/sdtformatlock" xmlns:w16se="http://schemas.microsoft.com/office/word/2015/wordml/symex" xmlns:wpg="http://schemas.microsoft.com/office/word/2010/wordprocessingGroup" xmlns:wpi="http://schemas.microsoft.com/office/word/2010/wordprocessingInk" xmlns:wne="http://schemas.microsoft.com/office/word/2006/wordml" xmlns:wps="http://schemas.microsoft.com/office/word/2010/wordprocessingShape" mc:Ignorable="w14 w15 w16se w16cid w16 w16cex w16sdtdh w16sdtfl w16du wp14">
+<w:ftr xmlns:wpc="http://schemas.microsoft.com/office/word/2010/wordprocessingCanvas" xmlns:cx="http://schemas.microsoft.com/office/drawing/2014/chartex" xmlns:cx1="http://schemas.microsoft.com/office/drawing/2015/9/8/chartex" xmlns:cx2="http://schemas.microsoft.com/office/drawing/2015/10/21/chartex" xmlns:cx3="http://schemas.microsoft.com/office/drawing/2016/5/9/chartex" xmlns:cx4="http://schemas.microsoft.com/office/drawing/2016/5/10/chartex" xmlns:cx5="http://schemas.microsoft.com/office/drawing/2016/5/11/chartex" xmlns:cx6="http://schemas.microsoft.com/office/drawing/2016/5/12/chartex" xmlns:cx7="http://schemas.microsoft.com/office/drawing/2016/5/13/chartex" xmlns:cx8="http://schemas.microsoft.com/office/drawing/2016/5/14/chartex" xmlns:mc="http://schemas.openxmlformats.org/markup-compatibility/2006" xmlns:m="http://schemas.openxmlformats.org/officeDocument/2006/math" xmlns:aink="http://schemas.microsoft.com/office/drawing/2016/ink" xmlns:am3d="http://schemas.microsoft.com/office/drawing/2017/model3d" xmlns:oel="http://schemas.microsoft.com/office/2019/extlst" xmlns:r="http://schemas.openxmlformats.org/officeDocument/2006/relationships" xmlns:wp14="http://schemas.microsoft.com/office/word/2010/wordprocessingDrawing" xmlns:wp="http://schemas.openxmlformats.org/drawingml/2006/wordprocessingDrawing" xmlns:wpg="http://schemas.microsoft.com/office/word/2010/wordprocessingGroup" xmlns:wpi="http://schemas.microsoft.com/office/word/2010/wordprocessingInk" xmlns:wps="http://schemas.microsoft.com/office/word/2010/wordprocessingShape" xmlns:o="urn:schemas-microsoft-com:office:office" xmlns:v="urn:schemas-microsoft-com:vml" xmlns:w10="urn:schemas-microsoft-com:office:word" xmlns:w="http://schemas.openxmlformats.org/wordprocessingml/2006/main" xmlns:w14="http://schemas.microsoft.com/office/word/2010/wordml" xmlns:w15="http://schemas.microsoft.com/office/word/2012/wordml" xmlns:w16cex="http://schemas.microsoft.com/office/word/2018/wordml/cex" xmlns:w16cid="http://schemas.microsoft.com/office/word/2016/wordml/cid" xmlns:w16="http://schemas.microsoft.com/office/word/2018/wordml" xmlns:w16sdtdh="http://schemas.microsoft.com/office/word/2020/wordml/sdtdatahash" xmlns:w16sdtfl="http://schemas.microsoft.com/office/word/2024/wordml/sdtformatlock" xmlns:w16se="http://schemas.microsoft.com/office/word/2015/wordml/symex" xmlns:w16du="http://schemas.microsoft.com/office/word/2023/wordml/word16du" xmlns:wne="http://schemas.microsoft.com/office/word/2006/wordml" mc:Ignorable="w14 w15 w16se w16cid w16 w16cex w16sdtdh w16sdtfl w16du wp14">
   <w:p>
     <w:pPr>
       <w:jc w:val="center"/>
@@ -27731,13 +27764,13 @@
 </file>
 
 <file path=word/footer7.xml><?xml version="1.0" encoding="utf-8"?>
-<w:ftr xmlns:wpc="http://schemas.microsoft.com/office/word/2010/wordprocessingCanvas" xmlns:cx="http://schemas.microsoft.com/office/drawing/2014/chartex" xmlns:cx1="http://schemas.microsoft.com/office/drawing/2015/9/8/chartex" xmlns:cx2="http://schemas.microsoft.com/office/drawing/2015/10/21/chartex" xmlns:cx3="http://schemas.microsoft.com/office/drawing/2016/5/9/chartex" xmlns:cx4="http://schemas.microsoft.com/office/drawing/2016/5/10/chartex" xmlns:cx5="http://schemas.microsoft.com/office/drawing/2016/5/11/chartex" xmlns:cx6="http://schemas.microsoft.com/office/drawing/2016/5/12/chartex" xmlns:cx7="http://schemas.microsoft.com/office/drawing/2016/5/13/chartex" xmlns:cx8="http://schemas.microsoft.com/office/drawing/2016/5/14/chartex" xmlns:mc="http://schemas.openxmlformats.org/markup-compatibility/2006" xmlns:aink="http://schemas.microsoft.com/office/drawing/2016/ink" xmlns:am3d="http://schemas.microsoft.com/office/drawing/2017/model3d" xmlns:o="urn:schemas-microsoft-com:office:office" xmlns:oel="http://schemas.microsoft.com/office/2019/extlst" xmlns:r="http://schemas.openxmlformats.org/officeDocument/2006/relationships" xmlns:m="http://schemas.openxmlformats.org/officeDocument/2006/math" xmlns:v="urn:schemas-microsoft-com:vml" xmlns:wp14="http://schemas.microsoft.com/office/word/2010/wordprocessingDrawing" xmlns:wp="http://schemas.openxmlformats.org/drawingml/2006/wordprocessingDrawing" xmlns:w10="urn:schemas-microsoft-com:office:word" xmlns:w="http://schemas.openxmlformats.org/wordprocessingml/2006/main" xmlns:w14="http://schemas.microsoft.com/office/word/2010/wordml" xmlns:w15="http://schemas.microsoft.com/office/word/2012/wordml" xmlns:w16cex="http://schemas.microsoft.com/office/word/2018/wordml/cex" xmlns:w16cid="http://schemas.microsoft.com/office/word/2016/wordml/cid" xmlns:w16="http://schemas.microsoft.com/office/word/2018/wordml" xmlns:w16du="http://schemas.microsoft.com/office/word/2023/wordml/word16du" xmlns:w16sdtdh="http://schemas.microsoft.com/office/word/2020/wordml/sdtdatahash" xmlns:w16sdtfl="http://schemas.microsoft.com/office/word/2024/wordml/sdtformatlock" xmlns:w16se="http://schemas.microsoft.com/office/word/2015/wordml/symex" xmlns:wpg="http://schemas.microsoft.com/office/word/2010/wordprocessingGroup" xmlns:wpi="http://schemas.microsoft.com/office/word/2010/wordprocessingInk" xmlns:wne="http://schemas.microsoft.com/office/word/2006/wordml" xmlns:wps="http://schemas.microsoft.com/office/word/2010/wordprocessingShape" mc:Ignorable="w14 w15 w16se w16cid w16 w16cex w16sdtdh w16sdtfl w16du wp14">
+<w:ftr xmlns:wpc="http://schemas.microsoft.com/office/word/2010/wordprocessingCanvas" xmlns:cx="http://schemas.microsoft.com/office/drawing/2014/chartex" xmlns:cx1="http://schemas.microsoft.com/office/drawing/2015/9/8/chartex" xmlns:cx2="http://schemas.microsoft.com/office/drawing/2015/10/21/chartex" xmlns:cx3="http://schemas.microsoft.com/office/drawing/2016/5/9/chartex" xmlns:cx4="http://schemas.microsoft.com/office/drawing/2016/5/10/chartex" xmlns:cx5="http://schemas.microsoft.com/office/drawing/2016/5/11/chartex" xmlns:cx6="http://schemas.microsoft.com/office/drawing/2016/5/12/chartex" xmlns:cx7="http://schemas.microsoft.com/office/drawing/2016/5/13/chartex" xmlns:cx8="http://schemas.microsoft.com/office/drawing/2016/5/14/chartex" xmlns:mc="http://schemas.openxmlformats.org/markup-compatibility/2006" xmlns:m="http://schemas.openxmlformats.org/officeDocument/2006/math" xmlns:aink="http://schemas.microsoft.com/office/drawing/2016/ink" xmlns:am3d="http://schemas.microsoft.com/office/drawing/2017/model3d" xmlns:oel="http://schemas.microsoft.com/office/2019/extlst" xmlns:r="http://schemas.openxmlformats.org/officeDocument/2006/relationships" xmlns:wp14="http://schemas.microsoft.com/office/word/2010/wordprocessingDrawing" xmlns:wp="http://schemas.openxmlformats.org/drawingml/2006/wordprocessingDrawing" xmlns:wpg="http://schemas.microsoft.com/office/word/2010/wordprocessingGroup" xmlns:wpi="http://schemas.microsoft.com/office/word/2010/wordprocessingInk" xmlns:wps="http://schemas.microsoft.com/office/word/2010/wordprocessingShape" xmlns:o="urn:schemas-microsoft-com:office:office" xmlns:v="urn:schemas-microsoft-com:vml" xmlns:w10="urn:schemas-microsoft-com:office:word" xmlns:w="http://schemas.openxmlformats.org/wordprocessingml/2006/main" xmlns:w14="http://schemas.microsoft.com/office/word/2010/wordml" xmlns:w15="http://schemas.microsoft.com/office/word/2012/wordml" xmlns:w16cex="http://schemas.microsoft.com/office/word/2018/wordml/cex" xmlns:w16cid="http://schemas.microsoft.com/office/word/2016/wordml/cid" xmlns:w16="http://schemas.microsoft.com/office/word/2018/wordml" xmlns:w16sdtdh="http://schemas.microsoft.com/office/word/2020/wordml/sdtdatahash" xmlns:w16sdtfl="http://schemas.microsoft.com/office/word/2024/wordml/sdtformatlock" xmlns:w16se="http://schemas.microsoft.com/office/word/2015/wordml/symex" xmlns:w16du="http://schemas.microsoft.com/office/word/2023/wordml/word16du" xmlns:wne="http://schemas.microsoft.com/office/word/2006/wordml" mc:Ignorable="w14 w15 w16se w16cid w16 w16cex w16sdtdh w16sdtfl w16du wp14">
   <w:p/>
 </w:ftr>
 </file>
 
 <file path=word/footnotes.xml><?xml version="1.0" encoding="utf-8"?>
-<w:footnotes xmlns:wpc="http://schemas.microsoft.com/office/word/2010/wordprocessingCanvas" xmlns:cx="http://schemas.microsoft.com/office/drawing/2014/chartex" xmlns:cx1="http://schemas.microsoft.com/office/drawing/2015/9/8/chartex" xmlns:cx2="http://schemas.microsoft.com/office/drawing/2015/10/21/chartex" xmlns:cx3="http://schemas.microsoft.com/office/drawing/2016/5/9/chartex" xmlns:cx4="http://schemas.microsoft.com/office/drawing/2016/5/10/chartex" xmlns:cx5="http://schemas.microsoft.com/office/drawing/2016/5/11/chartex" xmlns:cx6="http://schemas.microsoft.com/office/drawing/2016/5/12/chartex" xmlns:cx7="http://schemas.microsoft.com/office/drawing/2016/5/13/chartex" xmlns:cx8="http://schemas.microsoft.com/office/drawing/2016/5/14/chartex" xmlns:mc="http://schemas.openxmlformats.org/markup-compatibility/2006" xmlns:aink="http://schemas.microsoft.com/office/drawing/2016/ink" xmlns:am3d="http://schemas.microsoft.com/office/drawing/2017/model3d" xmlns:o="urn:schemas-microsoft-com:office:office" xmlns:oel="http://schemas.microsoft.com/office/2019/extlst" xmlns:r="http://schemas.openxmlformats.org/officeDocument/2006/relationships" xmlns:m="http://schemas.openxmlformats.org/officeDocument/2006/math" xmlns:v="urn:schemas-microsoft-com:vml" xmlns:wp14="http://schemas.microsoft.com/office/word/2010/wordprocessingDrawing" xmlns:wp="http://schemas.openxmlformats.org/drawingml/2006/wordprocessingDrawing" xmlns:w10="urn:schemas-microsoft-com:office:word" xmlns:w="http://schemas.openxmlformats.org/wordprocessingml/2006/main" xmlns:w14="http://schemas.microsoft.com/office/word/2010/wordml" xmlns:w15="http://schemas.microsoft.com/office/word/2012/wordml" xmlns:w16cex="http://schemas.microsoft.com/office/word/2018/wordml/cex" xmlns:w16cid="http://schemas.microsoft.com/office/word/2016/wordml/cid" xmlns:w16="http://schemas.microsoft.com/office/word/2018/wordml" xmlns:w16du="http://schemas.microsoft.com/office/word/2023/wordml/word16du" xmlns:w16sdtdh="http://schemas.microsoft.com/office/word/2020/wordml/sdtdatahash" xmlns:w16sdtfl="http://schemas.microsoft.com/office/word/2024/wordml/sdtformatlock" xmlns:w16se="http://schemas.microsoft.com/office/word/2015/wordml/symex" xmlns:wpg="http://schemas.microsoft.com/office/word/2010/wordprocessingGroup" xmlns:wpi="http://schemas.microsoft.com/office/word/2010/wordprocessingInk" xmlns:wne="http://schemas.microsoft.com/office/word/2006/wordml" xmlns:wps="http://schemas.microsoft.com/office/word/2010/wordprocessingShape" mc:Ignorable="w14 w15 w16se w16cid w16 w16cex w16sdtdh w16sdtfl w16du wp14">
+<w:footnotes xmlns:wpc="http://schemas.microsoft.com/office/word/2010/wordprocessingCanvas" xmlns:cx="http://schemas.microsoft.com/office/drawing/2014/chartex" xmlns:cx1="http://schemas.microsoft.com/office/drawing/2015/9/8/chartex" xmlns:cx2="http://schemas.microsoft.com/office/drawing/2015/10/21/chartex" xmlns:cx3="http://schemas.microsoft.com/office/drawing/2016/5/9/chartex" xmlns:cx4="http://schemas.microsoft.com/office/drawing/2016/5/10/chartex" xmlns:cx5="http://schemas.microsoft.com/office/drawing/2016/5/11/chartex" xmlns:cx6="http://schemas.microsoft.com/office/drawing/2016/5/12/chartex" xmlns:cx7="http://schemas.microsoft.com/office/drawing/2016/5/13/chartex" xmlns:cx8="http://schemas.microsoft.com/office/drawing/2016/5/14/chartex" xmlns:mc="http://schemas.openxmlformats.org/markup-compatibility/2006" xmlns:m="http://schemas.openxmlformats.org/officeDocument/2006/math" xmlns:aink="http://schemas.microsoft.com/office/drawing/2016/ink" xmlns:am3d="http://schemas.microsoft.com/office/drawing/2017/model3d" xmlns:oel="http://schemas.microsoft.com/office/2019/extlst" xmlns:r="http://schemas.openxmlformats.org/officeDocument/2006/relationships" xmlns:wp14="http://schemas.microsoft.com/office/word/2010/wordprocessingDrawing" xmlns:wp="http://schemas.openxmlformats.org/drawingml/2006/wordprocessingDrawing" xmlns:wpg="http://schemas.microsoft.com/office/word/2010/wordprocessingGroup" xmlns:wpi="http://schemas.microsoft.com/office/word/2010/wordprocessingInk" xmlns:wps="http://schemas.microsoft.com/office/word/2010/wordprocessingShape" xmlns:o="urn:schemas-microsoft-com:office:office" xmlns:v="urn:schemas-microsoft-com:vml" xmlns:w10="urn:schemas-microsoft-com:office:word" xmlns:w="http://schemas.openxmlformats.org/wordprocessingml/2006/main" xmlns:w14="http://schemas.microsoft.com/office/word/2010/wordml" xmlns:w15="http://schemas.microsoft.com/office/word/2012/wordml" xmlns:w16cex="http://schemas.microsoft.com/office/word/2018/wordml/cex" xmlns:w16cid="http://schemas.microsoft.com/office/word/2016/wordml/cid" xmlns:w16="http://schemas.microsoft.com/office/word/2018/wordml" xmlns:w16sdtdh="http://schemas.microsoft.com/office/word/2020/wordml/sdtdatahash" xmlns:w16sdtfl="http://schemas.microsoft.com/office/word/2024/wordml/sdtformatlock" xmlns:w16se="http://schemas.microsoft.com/office/word/2015/wordml/symex" xmlns:w16du="http://schemas.microsoft.com/office/word/2023/wordml/word16du" xmlns:wne="http://schemas.microsoft.com/office/word/2006/wordml" mc:Ignorable="w14 w15 w16se w16cid w16 w16cex w16sdtdh w16sdtfl w16du wp14">
   <w:footnote w:type="separator" w:id="-1">
     <w:p>
       <w:pPr>
@@ -27762,7 +27795,7 @@
 </file>
 
 <file path=word/header1.xml><?xml version="1.0" encoding="utf-8"?>
-<w:hdr xmlns:wpc="http://schemas.microsoft.com/office/word/2010/wordprocessingCanvas" xmlns:cx="http://schemas.microsoft.com/office/drawing/2014/chartex" xmlns:cx1="http://schemas.microsoft.com/office/drawing/2015/9/8/chartex" xmlns:cx2="http://schemas.microsoft.com/office/drawing/2015/10/21/chartex" xmlns:cx3="http://schemas.microsoft.com/office/drawing/2016/5/9/chartex" xmlns:cx4="http://schemas.microsoft.com/office/drawing/2016/5/10/chartex" xmlns:cx5="http://schemas.microsoft.com/office/drawing/2016/5/11/chartex" xmlns:cx6="http://schemas.microsoft.com/office/drawing/2016/5/12/chartex" xmlns:cx7="http://schemas.microsoft.com/office/drawing/2016/5/13/chartex" xmlns:cx8="http://schemas.microsoft.com/office/drawing/2016/5/14/chartex" xmlns:mc="http://schemas.openxmlformats.org/markup-compatibility/2006" xmlns:aink="http://schemas.microsoft.com/office/drawing/2016/ink" xmlns:am3d="http://schemas.microsoft.com/office/drawing/2017/model3d" xmlns:o="urn:schemas-microsoft-com:office:office" xmlns:oel="http://schemas.microsoft.com/office/2019/extlst" xmlns:r="http://schemas.openxmlformats.org/officeDocument/2006/relationships" xmlns:m="http://schemas.openxmlformats.org/officeDocument/2006/math" xmlns:v="urn:schemas-microsoft-com:vml" xmlns:wp14="http://schemas.microsoft.com/office/word/2010/wordprocessingDrawing" xmlns:wp="http://schemas.openxmlformats.org/drawingml/2006/wordprocessingDrawing" xmlns:w10="urn:schemas-microsoft-com:office:word" xmlns:w="http://schemas.openxmlformats.org/wordprocessingml/2006/main" xmlns:w14="http://schemas.microsoft.com/office/word/2010/wordml" xmlns:w15="http://schemas.microsoft.com/office/word/2012/wordml" xmlns:w16cex="http://schemas.microsoft.com/office/word/2018/wordml/cex" xmlns:w16cid="http://schemas.microsoft.com/office/word/2016/wordml/cid" xmlns:w16="http://schemas.microsoft.com/office/word/2018/wordml" xmlns:w16du="http://schemas.microsoft.com/office/word/2023/wordml/word16du" xmlns:w16sdtdh="http://schemas.microsoft.com/office/word/2020/wordml/sdtdatahash" xmlns:w16sdtfl="http://schemas.microsoft.com/office/word/2024/wordml/sdtformatlock" xmlns:w16se="http://schemas.microsoft.com/office/word/2015/wordml/symex" xmlns:wpg="http://schemas.microsoft.com/office/word/2010/wordprocessingGroup" xmlns:wpi="http://schemas.microsoft.com/office/word/2010/wordprocessingInk" xmlns:wne="http://schemas.microsoft.com/office/word/2006/wordml" xmlns:wps="http://schemas.microsoft.com/office/word/2010/wordprocessingShape" mc:Ignorable="w14 w15 w16se w16cid w16 w16cex w16sdtdh w16sdtfl w16du wp14">
+<w:hdr xmlns:wpc="http://schemas.microsoft.com/office/word/2010/wordprocessingCanvas" xmlns:cx="http://schemas.microsoft.com/office/drawing/2014/chartex" xmlns:cx1="http://schemas.microsoft.com/office/drawing/2015/9/8/chartex" xmlns:cx2="http://schemas.microsoft.com/office/drawing/2015/10/21/chartex" xmlns:cx3="http://schemas.microsoft.com/office/drawing/2016/5/9/chartex" xmlns:cx4="http://schemas.microsoft.com/office/drawing/2016/5/10/chartex" xmlns:cx5="http://schemas.microsoft.com/office/drawing/2016/5/11/chartex" xmlns:cx6="http://schemas.microsoft.com/office/drawing/2016/5/12/chartex" xmlns:cx7="http://schemas.microsoft.com/office/drawing/2016/5/13/chartex" xmlns:cx8="http://schemas.microsoft.com/office/drawing/2016/5/14/chartex" xmlns:mc="http://schemas.openxmlformats.org/markup-compatibility/2006" xmlns:m="http://schemas.openxmlformats.org/officeDocument/2006/math" xmlns:aink="http://schemas.microsoft.com/office/drawing/2016/ink" xmlns:am3d="http://schemas.microsoft.com/office/drawing/2017/model3d" xmlns:oel="http://schemas.microsoft.com/office/2019/extlst" xmlns:r="http://schemas.openxmlformats.org/officeDocument/2006/relationships" xmlns:wp14="http://schemas.microsoft.com/office/word/2010/wordprocessingDrawing" xmlns:wp="http://schemas.openxmlformats.org/drawingml/2006/wordprocessingDrawing" xmlns:wpg="http://schemas.microsoft.com/office/word/2010/wordprocessingGroup" xmlns:wpi="http://schemas.microsoft.com/office/word/2010/wordprocessingInk" xmlns:wps="http://schemas.microsoft.com/office/word/2010/wordprocessingShape" xmlns:o="urn:schemas-microsoft-com:office:office" xmlns:v="urn:schemas-microsoft-com:vml" xmlns:w10="urn:schemas-microsoft-com:office:word" xmlns:w="http://schemas.openxmlformats.org/wordprocessingml/2006/main" xmlns:w14="http://schemas.microsoft.com/office/word/2010/wordml" xmlns:w15="http://schemas.microsoft.com/office/word/2012/wordml" xmlns:w16cex="http://schemas.microsoft.com/office/word/2018/wordml/cex" xmlns:w16cid="http://schemas.microsoft.com/office/word/2016/wordml/cid" xmlns:w16="http://schemas.microsoft.com/office/word/2018/wordml" xmlns:w16sdtdh="http://schemas.microsoft.com/office/word/2020/wordml/sdtdatahash" xmlns:w16sdtfl="http://schemas.microsoft.com/office/word/2024/wordml/sdtformatlock" xmlns:w16se="http://schemas.microsoft.com/office/word/2015/wordml/symex" xmlns:w16du="http://schemas.microsoft.com/office/word/2023/wordml/word16du" xmlns:wne="http://schemas.microsoft.com/office/word/2006/wordml" mc:Ignorable="w14 w15 w16se w16cid w16 w16cex w16sdtdh w16sdtfl w16du wp14">
   <w:p>
     <w:pPr>
       <w:pStyle w:val="ad"/>
@@ -27772,7 +27805,7 @@
 </file>
 
 <file path=word/header2.xml><?xml version="1.0" encoding="utf-8"?>
-<w:hdr xmlns:wpc="http://schemas.microsoft.com/office/word/2010/wordprocessingCanvas" xmlns:cx="http://schemas.microsoft.com/office/drawing/2014/chartex" xmlns:cx1="http://schemas.microsoft.com/office/drawing/2015/9/8/chartex" xmlns:cx2="http://schemas.microsoft.com/office/drawing/2015/10/21/chartex" xmlns:cx3="http://schemas.microsoft.com/office/drawing/2016/5/9/chartex" xmlns:cx4="http://schemas.microsoft.com/office/drawing/2016/5/10/chartex" xmlns:cx5="http://schemas.microsoft.com/office/drawing/2016/5/11/chartex" xmlns:cx6="http://schemas.microsoft.com/office/drawing/2016/5/12/chartex" xmlns:cx7="http://schemas.microsoft.com/office/drawing/2016/5/13/chartex" xmlns:cx8="http://schemas.microsoft.com/office/drawing/2016/5/14/chartex" xmlns:mc="http://schemas.openxmlformats.org/markup-compatibility/2006" xmlns:aink="http://schemas.microsoft.com/office/drawing/2016/ink" xmlns:am3d="http://schemas.microsoft.com/office/drawing/2017/model3d" xmlns:o="urn:schemas-microsoft-com:office:office" xmlns:oel="http://schemas.microsoft.com/office/2019/extlst" xmlns:r="http://schemas.openxmlformats.org/officeDocument/2006/relationships" xmlns:m="http://schemas.openxmlformats.org/officeDocument/2006/math" xmlns:v="urn:schemas-microsoft-com:vml" xmlns:wp14="http://schemas.microsoft.com/office/word/2010/wordprocessingDrawing" xmlns:wp="http://schemas.openxmlformats.org/drawingml/2006/wordprocessingDrawing" xmlns:w10="urn:schemas-microsoft-com:office:word" xmlns:w="http://schemas.openxmlformats.org/wordprocessingml/2006/main" xmlns:w14="http://schemas.microsoft.com/office/word/2010/wordml" xmlns:w15="http://schemas.microsoft.com/office/word/2012/wordml" xmlns:w16cex="http://schemas.microsoft.com/office/word/2018/wordml/cex" xmlns:w16cid="http://schemas.microsoft.com/office/word/2016/wordml/cid" xmlns:w16="http://schemas.microsoft.com/office/word/2018/wordml" xmlns:w16du="http://schemas.microsoft.com/office/word/2023/wordml/word16du" xmlns:w16sdtdh="http://schemas.microsoft.com/office/word/2020/wordml/sdtdatahash" xmlns:w16sdtfl="http://schemas.microsoft.com/office/word/2024/wordml/sdtformatlock" xmlns:w16se="http://schemas.microsoft.com/office/word/2015/wordml/symex" xmlns:wpg="http://schemas.microsoft.com/office/word/2010/wordprocessingGroup" xmlns:wpi="http://schemas.microsoft.com/office/word/2010/wordprocessingInk" xmlns:wne="http://schemas.microsoft.com/office/word/2006/wordml" xmlns:wps="http://schemas.microsoft.com/office/word/2010/wordprocessingShape" mc:Ignorable="w14 w15 w16se w16cid w16 w16cex w16sdtdh w16sdtfl w16du wp14">
+<w:hdr xmlns:wpc="http://schemas.microsoft.com/office/word/2010/wordprocessingCanvas" xmlns:cx="http://schemas.microsoft.com/office/drawing/2014/chartex" xmlns:cx1="http://schemas.microsoft.com/office/drawing/2015/9/8/chartex" xmlns:cx2="http://schemas.microsoft.com/office/drawing/2015/10/21/chartex" xmlns:cx3="http://schemas.microsoft.com/office/drawing/2016/5/9/chartex" xmlns:cx4="http://schemas.microsoft.com/office/drawing/2016/5/10/chartex" xmlns:cx5="http://schemas.microsoft.com/office/drawing/2016/5/11/chartex" xmlns:cx6="http://schemas.microsoft.com/office/drawing/2016/5/12/chartex" xmlns:cx7="http://schemas.microsoft.com/office/drawing/2016/5/13/chartex" xmlns:cx8="http://schemas.microsoft.com/office/drawing/2016/5/14/chartex" xmlns:mc="http://schemas.openxmlformats.org/markup-compatibility/2006" xmlns:m="http://schemas.openxmlformats.org/officeDocument/2006/math" xmlns:aink="http://schemas.microsoft.com/office/drawing/2016/ink" xmlns:am3d="http://schemas.microsoft.com/office/drawing/2017/model3d" xmlns:oel="http://schemas.microsoft.com/office/2019/extlst" xmlns:r="http://schemas.openxmlformats.org/officeDocument/2006/relationships" xmlns:wp14="http://schemas.microsoft.com/office/word/2010/wordprocessingDrawing" xmlns:wp="http://schemas.openxmlformats.org/drawingml/2006/wordprocessingDrawing" xmlns:wpg="http://schemas.microsoft.com/office/word/2010/wordprocessingGroup" xmlns:wpi="http://schemas.microsoft.com/office/word/2010/wordprocessingInk" xmlns:wps="http://schemas.microsoft.com/office/word/2010/wordprocessingShape" xmlns:o="urn:schemas-microsoft-com:office:office" xmlns:v="urn:schemas-microsoft-com:vml" xmlns:w10="urn:schemas-microsoft-com:office:word" xmlns:w="http://schemas.openxmlformats.org/wordprocessingml/2006/main" xmlns:w14="http://schemas.microsoft.com/office/word/2010/wordml" xmlns:w15="http://schemas.microsoft.com/office/word/2012/wordml" xmlns:w16cex="http://schemas.microsoft.com/office/word/2018/wordml/cex" xmlns:w16cid="http://schemas.microsoft.com/office/word/2016/wordml/cid" xmlns:w16="http://schemas.microsoft.com/office/word/2018/wordml" xmlns:w16sdtdh="http://schemas.microsoft.com/office/word/2020/wordml/sdtdatahash" xmlns:w16sdtfl="http://schemas.microsoft.com/office/word/2024/wordml/sdtformatlock" xmlns:w16se="http://schemas.microsoft.com/office/word/2015/wordml/symex" xmlns:w16du="http://schemas.microsoft.com/office/word/2023/wordml/word16du" xmlns:wne="http://schemas.microsoft.com/office/word/2006/wordml" mc:Ignorable="w14 w15 w16se w16cid w16 w16cex w16sdtdh w16sdtfl w16du wp14">
   <w:p>
     <w:pPr>
       <w:pBdr>
@@ -27806,7 +27839,7 @@
 </file>
 
 <file path=word/header3.xml><?xml version="1.0" encoding="utf-8"?>
-<w:hdr xmlns:wpc="http://schemas.microsoft.com/office/word/2010/wordprocessingCanvas" xmlns:cx="http://schemas.microsoft.com/office/drawing/2014/chartex" xmlns:cx1="http://schemas.microsoft.com/office/drawing/2015/9/8/chartex" xmlns:cx2="http://schemas.microsoft.com/office/drawing/2015/10/21/chartex" xmlns:cx3="http://schemas.microsoft.com/office/drawing/2016/5/9/chartex" xmlns:cx4="http://schemas.microsoft.com/office/drawing/2016/5/10/chartex" xmlns:cx5="http://schemas.microsoft.com/office/drawing/2016/5/11/chartex" xmlns:cx6="http://schemas.microsoft.com/office/drawing/2016/5/12/chartex" xmlns:cx7="http://schemas.microsoft.com/office/drawing/2016/5/13/chartex" xmlns:cx8="http://schemas.microsoft.com/office/drawing/2016/5/14/chartex" xmlns:mc="http://schemas.openxmlformats.org/markup-compatibility/2006" xmlns:aink="http://schemas.microsoft.com/office/drawing/2016/ink" xmlns:am3d="http://schemas.microsoft.com/office/drawing/2017/model3d" xmlns:o="urn:schemas-microsoft-com:office:office" xmlns:oel="http://schemas.microsoft.com/office/2019/extlst" xmlns:r="http://schemas.openxmlformats.org/officeDocument/2006/relationships" xmlns:m="http://schemas.openxmlformats.org/officeDocument/2006/math" xmlns:v="urn:schemas-microsoft-com:vml" xmlns:wp14="http://schemas.microsoft.com/office/word/2010/wordprocessingDrawing" xmlns:wp="http://schemas.openxmlformats.org/drawingml/2006/wordprocessingDrawing" xmlns:w10="urn:schemas-microsoft-com:office:word" xmlns:w="http://schemas.openxmlformats.org/wordprocessingml/2006/main" xmlns:w14="http://schemas.microsoft.com/office/word/2010/wordml" xmlns:w15="http://schemas.microsoft.com/office/word/2012/wordml" xmlns:w16cex="http://schemas.microsoft.com/office/word/2018/wordml/cex" xmlns:w16cid="http://schemas.microsoft.com/office/word/2016/wordml/cid" xmlns:w16="http://schemas.microsoft.com/office/word/2018/wordml" xmlns:w16du="http://schemas.microsoft.com/office/word/2023/wordml/word16du" xmlns:w16sdtdh="http://schemas.microsoft.com/office/word/2020/wordml/sdtdatahash" xmlns:w16sdtfl="http://schemas.microsoft.com/office/word/2024/wordml/sdtformatlock" xmlns:w16se="http://schemas.microsoft.com/office/word/2015/wordml/symex" xmlns:wpg="http://schemas.microsoft.com/office/word/2010/wordprocessingGroup" xmlns:wpi="http://schemas.microsoft.com/office/word/2010/wordprocessingInk" xmlns:wne="http://schemas.microsoft.com/office/word/2006/wordml" xmlns:wps="http://schemas.microsoft.com/office/word/2010/wordprocessingShape" mc:Ignorable="w14 w15 w16se w16cid w16 w16cex w16sdtdh w16sdtfl w16du wp14">
+<w:hdr xmlns:wpc="http://schemas.microsoft.com/office/word/2010/wordprocessingCanvas" xmlns:cx="http://schemas.microsoft.com/office/drawing/2014/chartex" xmlns:cx1="http://schemas.microsoft.com/office/drawing/2015/9/8/chartex" xmlns:cx2="http://schemas.microsoft.com/office/drawing/2015/10/21/chartex" xmlns:cx3="http://schemas.microsoft.com/office/drawing/2016/5/9/chartex" xmlns:cx4="http://schemas.microsoft.com/office/drawing/2016/5/10/chartex" xmlns:cx5="http://schemas.microsoft.com/office/drawing/2016/5/11/chartex" xmlns:cx6="http://schemas.microsoft.com/office/drawing/2016/5/12/chartex" xmlns:cx7="http://schemas.microsoft.com/office/drawing/2016/5/13/chartex" xmlns:cx8="http://schemas.microsoft.com/office/drawing/2016/5/14/chartex" xmlns:mc="http://schemas.openxmlformats.org/markup-compatibility/2006" xmlns:m="http://schemas.openxmlformats.org/officeDocument/2006/math" xmlns:aink="http://schemas.microsoft.com/office/drawing/2016/ink" xmlns:am3d="http://schemas.microsoft.com/office/drawing/2017/model3d" xmlns:oel="http://schemas.microsoft.com/office/2019/extlst" xmlns:r="http://schemas.openxmlformats.org/officeDocument/2006/relationships" xmlns:wp14="http://schemas.microsoft.com/office/word/2010/wordprocessingDrawing" xmlns:wp="http://schemas.openxmlformats.org/drawingml/2006/wordprocessingDrawing" xmlns:wpg="http://schemas.microsoft.com/office/word/2010/wordprocessingGroup" xmlns:wpi="http://schemas.microsoft.com/office/word/2010/wordprocessingInk" xmlns:wps="http://schemas.microsoft.com/office/word/2010/wordprocessingShape" xmlns:o="urn:schemas-microsoft-com:office:office" xmlns:v="urn:schemas-microsoft-com:vml" xmlns:w10="urn:schemas-microsoft-com:office:word" xmlns:w="http://schemas.openxmlformats.org/wordprocessingml/2006/main" xmlns:w14="http://schemas.microsoft.com/office/word/2010/wordml" xmlns:w15="http://schemas.microsoft.com/office/word/2012/wordml" xmlns:w16cex="http://schemas.microsoft.com/office/word/2018/wordml/cex" xmlns:w16cid="http://schemas.microsoft.com/office/word/2016/wordml/cid" xmlns:w16="http://schemas.microsoft.com/office/word/2018/wordml" xmlns:w16sdtdh="http://schemas.microsoft.com/office/word/2020/wordml/sdtdatahash" xmlns:w16sdtfl="http://schemas.microsoft.com/office/word/2024/wordml/sdtformatlock" xmlns:w16se="http://schemas.microsoft.com/office/word/2015/wordml/symex" xmlns:w16du="http://schemas.microsoft.com/office/word/2023/wordml/word16du" xmlns:wne="http://schemas.microsoft.com/office/word/2006/wordml" mc:Ignorable="w14 w15 w16se w16cid w16 w16cex w16sdtdh w16sdtfl w16du wp14">
   <w:p>
     <w:pPr>
       <w:pBdr>
@@ -27840,7 +27873,7 @@
 </file>
 
 <file path=word/header4.xml><?xml version="1.0" encoding="utf-8"?>
-<w:hdr xmlns:wpc="http://schemas.microsoft.com/office/word/2010/wordprocessingCanvas" xmlns:cx="http://schemas.microsoft.com/office/drawing/2014/chartex" xmlns:cx1="http://schemas.microsoft.com/office/drawing/2015/9/8/chartex" xmlns:cx2="http://schemas.microsoft.com/office/drawing/2015/10/21/chartex" xmlns:cx3="http://schemas.microsoft.com/office/drawing/2016/5/9/chartex" xmlns:cx4="http://schemas.microsoft.com/office/drawing/2016/5/10/chartex" xmlns:cx5="http://schemas.microsoft.com/office/drawing/2016/5/11/chartex" xmlns:cx6="http://schemas.microsoft.com/office/drawing/2016/5/12/chartex" xmlns:cx7="http://schemas.microsoft.com/office/drawing/2016/5/13/chartex" xmlns:cx8="http://schemas.microsoft.com/office/drawing/2016/5/14/chartex" xmlns:mc="http://schemas.openxmlformats.org/markup-compatibility/2006" xmlns:aink="http://schemas.microsoft.com/office/drawing/2016/ink" xmlns:am3d="http://schemas.microsoft.com/office/drawing/2017/model3d" xmlns:o="urn:schemas-microsoft-com:office:office" xmlns:oel="http://schemas.microsoft.com/office/2019/extlst" xmlns:r="http://schemas.openxmlformats.org/officeDocument/2006/relationships" xmlns:m="http://schemas.openxmlformats.org/officeDocument/2006/math" xmlns:v="urn:schemas-microsoft-com:vml" xmlns:wp14="http://schemas.microsoft.com/office/word/2010/wordprocessingDrawing" xmlns:wp="http://schemas.openxmlformats.org/drawingml/2006/wordprocessingDrawing" xmlns:w10="urn:schemas-microsoft-com:office:word" xmlns:w="http://schemas.openxmlformats.org/wordprocessingml/2006/main" xmlns:w14="http://schemas.microsoft.com/office/word/2010/wordml" xmlns:w15="http://schemas.microsoft.com/office/word/2012/wordml" xmlns:w16cex="http://schemas.microsoft.com/office/word/2018/wordml/cex" xmlns:w16cid="http://schemas.microsoft.com/office/word/2016/wordml/cid" xmlns:w16="http://schemas.microsoft.com/office/word/2018/wordml" xmlns:w16du="http://schemas.microsoft.com/office/word/2023/wordml/word16du" xmlns:w16sdtdh="http://schemas.microsoft.com/office/word/2020/wordml/sdtdatahash" xmlns:w16sdtfl="http://schemas.microsoft.com/office/word/2024/wordml/sdtformatlock" xmlns:w16se="http://schemas.microsoft.com/office/word/2015/wordml/symex" xmlns:wpg="http://schemas.microsoft.com/office/word/2010/wordprocessingGroup" xmlns:wpi="http://schemas.microsoft.com/office/word/2010/wordprocessingInk" xmlns:wne="http://schemas.microsoft.com/office/word/2006/wordml" xmlns:wps="http://schemas.microsoft.com/office/word/2010/wordprocessingShape" mc:Ignorable="w14 w15 w16se w16cid w16 w16cex w16sdtdh w16sdtfl w16du wp14">
+<w:hdr xmlns:wpc="http://schemas.microsoft.com/office/word/2010/wordprocessingCanvas" xmlns:cx="http://schemas.microsoft.com/office/drawing/2014/chartex" xmlns:cx1="http://schemas.microsoft.com/office/drawing/2015/9/8/chartex" xmlns:cx2="http://schemas.microsoft.com/office/drawing/2015/10/21/chartex" xmlns:cx3="http://schemas.microsoft.com/office/drawing/2016/5/9/chartex" xmlns:cx4="http://schemas.microsoft.com/office/drawing/2016/5/10/chartex" xmlns:cx5="http://schemas.microsoft.com/office/drawing/2016/5/11/chartex" xmlns:cx6="http://schemas.microsoft.com/office/drawing/2016/5/12/chartex" xmlns:cx7="http://schemas.microsoft.com/office/drawing/2016/5/13/chartex" xmlns:cx8="http://schemas.microsoft.com/office/drawing/2016/5/14/chartex" xmlns:mc="http://schemas.openxmlformats.org/markup-compatibility/2006" xmlns:m="http://schemas.openxmlformats.org/officeDocument/2006/math" xmlns:aink="http://schemas.microsoft.com/office/drawing/2016/ink" xmlns:am3d="http://schemas.microsoft.com/office/drawing/2017/model3d" xmlns:oel="http://schemas.microsoft.com/office/2019/extlst" xmlns:r="http://schemas.openxmlformats.org/officeDocument/2006/relationships" xmlns:wp14="http://schemas.microsoft.com/office/word/2010/wordprocessingDrawing" xmlns:wp="http://schemas.openxmlformats.org/drawingml/2006/wordprocessingDrawing" xmlns:wpg="http://schemas.microsoft.com/office/word/2010/wordprocessingGroup" xmlns:wpi="http://schemas.microsoft.com/office/word/2010/wordprocessingInk" xmlns:wps="http://schemas.microsoft.com/office/word/2010/wordprocessingShape" xmlns:o="urn:schemas-microsoft-com:office:office" xmlns:v="urn:schemas-microsoft-com:vml" xmlns:w10="urn:schemas-microsoft-com:office:word" xmlns:w="http://schemas.openxmlformats.org/wordprocessingml/2006/main" xmlns:w14="http://schemas.microsoft.com/office/word/2010/wordml" xmlns:w15="http://schemas.microsoft.com/office/word/2012/wordml" xmlns:w16cex="http://schemas.microsoft.com/office/word/2018/wordml/cex" xmlns:w16cid="http://schemas.microsoft.com/office/word/2016/wordml/cid" xmlns:w16="http://schemas.microsoft.com/office/word/2018/wordml" xmlns:w16sdtdh="http://schemas.microsoft.com/office/word/2020/wordml/sdtdatahash" xmlns:w16sdtfl="http://schemas.microsoft.com/office/word/2024/wordml/sdtformatlock" xmlns:w16se="http://schemas.microsoft.com/office/word/2015/wordml/symex" xmlns:w16du="http://schemas.microsoft.com/office/word/2023/wordml/word16du" xmlns:wne="http://schemas.microsoft.com/office/word/2006/wordml" mc:Ignorable="w14 w15 w16se w16cid w16 w16cex w16sdtdh w16sdtfl w16du wp14">
   <w:p>
     <w:pPr>
       <w:pBdr>
@@ -27874,13 +27907,13 @@
 </file>
 
 <file path=word/header5.xml><?xml version="1.0" encoding="utf-8"?>
-<w:hdr xmlns:wpc="http://schemas.microsoft.com/office/word/2010/wordprocessingCanvas" xmlns:cx="http://schemas.microsoft.com/office/drawing/2014/chartex" xmlns:cx1="http://schemas.microsoft.com/office/drawing/2015/9/8/chartex" xmlns:cx2="http://schemas.microsoft.com/office/drawing/2015/10/21/chartex" xmlns:cx3="http://schemas.microsoft.com/office/drawing/2016/5/9/chartex" xmlns:cx4="http://schemas.microsoft.com/office/drawing/2016/5/10/chartex" xmlns:cx5="http://schemas.microsoft.com/office/drawing/2016/5/11/chartex" xmlns:cx6="http://schemas.microsoft.com/office/drawing/2016/5/12/chartex" xmlns:cx7="http://schemas.microsoft.com/office/drawing/2016/5/13/chartex" xmlns:cx8="http://schemas.microsoft.com/office/drawing/2016/5/14/chartex" xmlns:mc="http://schemas.openxmlformats.org/markup-compatibility/2006" xmlns:aink="http://schemas.microsoft.com/office/drawing/2016/ink" xmlns:am3d="http://schemas.microsoft.com/office/drawing/2017/model3d" xmlns:o="urn:schemas-microsoft-com:office:office" xmlns:oel="http://schemas.microsoft.com/office/2019/extlst" xmlns:r="http://schemas.openxmlformats.org/officeDocument/2006/relationships" xmlns:m="http://schemas.openxmlformats.org/officeDocument/2006/math" xmlns:v="urn:schemas-microsoft-com:vml" xmlns:wp14="http://schemas.microsoft.com/office/word/2010/wordprocessingDrawing" xmlns:wp="http://schemas.openxmlformats.org/drawingml/2006/wordprocessingDrawing" xmlns:w10="urn:schemas-microsoft-com:office:word" xmlns:w="http://schemas.openxmlformats.org/wordprocessingml/2006/main" xmlns:w14="http://schemas.microsoft.com/office/word/2010/wordml" xmlns:w15="http://schemas.microsoft.com/office/word/2012/wordml" xmlns:w16cex="http://schemas.microsoft.com/office/word/2018/wordml/cex" xmlns:w16cid="http://schemas.microsoft.com/office/word/2016/wordml/cid" xmlns:w16="http://schemas.microsoft.com/office/word/2018/wordml" xmlns:w16du="http://schemas.microsoft.com/office/word/2023/wordml/word16du" xmlns:w16sdtdh="http://schemas.microsoft.com/office/word/2020/wordml/sdtdatahash" xmlns:w16sdtfl="http://schemas.microsoft.com/office/word/2024/wordml/sdtformatlock" xmlns:w16se="http://schemas.microsoft.com/office/word/2015/wordml/symex" xmlns:wpg="http://schemas.microsoft.com/office/word/2010/wordprocessingGroup" xmlns:wpi="http://schemas.microsoft.com/office/word/2010/wordprocessingInk" xmlns:wne="http://schemas.microsoft.com/office/word/2006/wordml" xmlns:wps="http://schemas.microsoft.com/office/word/2010/wordprocessingShape" mc:Ignorable="w14 w15 w16se w16cid w16 w16cex w16sdtdh w16sdtfl w16du wp14">
+<w:hdr xmlns:wpc="http://schemas.microsoft.com/office/word/2010/wordprocessingCanvas" xmlns:cx="http://schemas.microsoft.com/office/drawing/2014/chartex" xmlns:cx1="http://schemas.microsoft.com/office/drawing/2015/9/8/chartex" xmlns:cx2="http://schemas.microsoft.com/office/drawing/2015/10/21/chartex" xmlns:cx3="http://schemas.microsoft.com/office/drawing/2016/5/9/chartex" xmlns:cx4="http://schemas.microsoft.com/office/drawing/2016/5/10/chartex" xmlns:cx5="http://schemas.microsoft.com/office/drawing/2016/5/11/chartex" xmlns:cx6="http://schemas.microsoft.com/office/drawing/2016/5/12/chartex" xmlns:cx7="http://schemas.microsoft.com/office/drawing/2016/5/13/chartex" xmlns:cx8="http://schemas.microsoft.com/office/drawing/2016/5/14/chartex" xmlns:mc="http://schemas.openxmlformats.org/markup-compatibility/2006" xmlns:m="http://schemas.openxmlformats.org/officeDocument/2006/math" xmlns:aink="http://schemas.microsoft.com/office/drawing/2016/ink" xmlns:am3d="http://schemas.microsoft.com/office/drawing/2017/model3d" xmlns:oel="http://schemas.microsoft.com/office/2019/extlst" xmlns:r="http://schemas.openxmlformats.org/officeDocument/2006/relationships" xmlns:wp14="http://schemas.microsoft.com/office/word/2010/wordprocessingDrawing" xmlns:wp="http://schemas.openxmlformats.org/drawingml/2006/wordprocessingDrawing" xmlns:wpg="http://schemas.microsoft.com/office/word/2010/wordprocessingGroup" xmlns:wpi="http://schemas.microsoft.com/office/word/2010/wordprocessingInk" xmlns:wps="http://schemas.microsoft.com/office/word/2010/wordprocessingShape" xmlns:o="urn:schemas-microsoft-com:office:office" xmlns:v="urn:schemas-microsoft-com:vml" xmlns:w10="urn:schemas-microsoft-com:office:word" xmlns:w="http://schemas.openxmlformats.org/wordprocessingml/2006/main" xmlns:w14="http://schemas.microsoft.com/office/word/2010/wordml" xmlns:w15="http://schemas.microsoft.com/office/word/2012/wordml" xmlns:w16cex="http://schemas.microsoft.com/office/word/2018/wordml/cex" xmlns:w16cid="http://schemas.microsoft.com/office/word/2016/wordml/cid" xmlns:w16="http://schemas.microsoft.com/office/word/2018/wordml" xmlns:w16sdtdh="http://schemas.microsoft.com/office/word/2020/wordml/sdtdatahash" xmlns:w16sdtfl="http://schemas.microsoft.com/office/word/2024/wordml/sdtformatlock" xmlns:w16se="http://schemas.microsoft.com/office/word/2015/wordml/symex" xmlns:w16du="http://schemas.microsoft.com/office/word/2023/wordml/word16du" xmlns:wne="http://schemas.microsoft.com/office/word/2006/wordml" mc:Ignorable="w14 w15 w16se w16cid w16 w16cex w16sdtdh w16sdtfl w16du wp14">
   <w:p/>
 </w:hdr>
 </file>
 
 <file path=word/header6.xml><?xml version="1.0" encoding="utf-8"?>
-<w:hdr xmlns:wpc="http://schemas.microsoft.com/office/word/2010/wordprocessingCanvas" xmlns:cx="http://schemas.microsoft.com/office/drawing/2014/chartex" xmlns:cx1="http://schemas.microsoft.com/office/drawing/2015/9/8/chartex" xmlns:cx2="http://schemas.microsoft.com/office/drawing/2015/10/21/chartex" xmlns:cx3="http://schemas.microsoft.com/office/drawing/2016/5/9/chartex" xmlns:cx4="http://schemas.microsoft.com/office/drawing/2016/5/10/chartex" xmlns:cx5="http://schemas.microsoft.com/office/drawing/2016/5/11/chartex" xmlns:cx6="http://schemas.microsoft.com/office/drawing/2016/5/12/chartex" xmlns:cx7="http://schemas.microsoft.com/office/drawing/2016/5/13/chartex" xmlns:cx8="http://schemas.microsoft.com/office/drawing/2016/5/14/chartex" xmlns:mc="http://schemas.openxmlformats.org/markup-compatibility/2006" xmlns:aink="http://schemas.microsoft.com/office/drawing/2016/ink" xmlns:am3d="http://schemas.microsoft.com/office/drawing/2017/model3d" xmlns:o="urn:schemas-microsoft-com:office:office" xmlns:oel="http://schemas.microsoft.com/office/2019/extlst" xmlns:r="http://schemas.openxmlformats.org/officeDocument/2006/relationships" xmlns:m="http://schemas.openxmlformats.org/officeDocument/2006/math" xmlns:v="urn:schemas-microsoft-com:vml" xmlns:wp14="http://schemas.microsoft.com/office/word/2010/wordprocessingDrawing" xmlns:wp="http://schemas.openxmlformats.org/drawingml/2006/wordprocessingDrawing" xmlns:w10="urn:schemas-microsoft-com:office:word" xmlns:w="http://schemas.openxmlformats.org/wordprocessingml/2006/main" xmlns:w14="http://schemas.microsoft.com/office/word/2010/wordml" xmlns:w15="http://schemas.microsoft.com/office/word/2012/wordml" xmlns:w16cex="http://schemas.microsoft.com/office/word/2018/wordml/cex" xmlns:w16cid="http://schemas.microsoft.com/office/word/2016/wordml/cid" xmlns:w16="http://schemas.microsoft.com/office/word/2018/wordml" xmlns:w16du="http://schemas.microsoft.com/office/word/2023/wordml/word16du" xmlns:w16sdtdh="http://schemas.microsoft.com/office/word/2020/wordml/sdtdatahash" xmlns:w16sdtfl="http://schemas.microsoft.com/office/word/2024/wordml/sdtformatlock" xmlns:w16se="http://schemas.microsoft.com/office/word/2015/wordml/symex" xmlns:wpg="http://schemas.microsoft.com/office/word/2010/wordprocessingGroup" xmlns:wpi="http://schemas.microsoft.com/office/word/2010/wordprocessingInk" xmlns:wne="http://schemas.microsoft.com/office/word/2006/wordml" xmlns:wps="http://schemas.microsoft.com/office/word/2010/wordprocessingShape" mc:Ignorable="w14 w15 w16se w16cid w16 w16cex w16sdtdh w16sdtfl w16du wp14">
+<w:hdr xmlns:wpc="http://schemas.microsoft.com/office/word/2010/wordprocessingCanvas" xmlns:cx="http://schemas.microsoft.com/office/drawing/2014/chartex" xmlns:cx1="http://schemas.microsoft.com/office/drawing/2015/9/8/chartex" xmlns:cx2="http://schemas.microsoft.com/office/drawing/2015/10/21/chartex" xmlns:cx3="http://schemas.microsoft.com/office/drawing/2016/5/9/chartex" xmlns:cx4="http://schemas.microsoft.com/office/drawing/2016/5/10/chartex" xmlns:cx5="http://schemas.microsoft.com/office/drawing/2016/5/11/chartex" xmlns:cx6="http://schemas.microsoft.com/office/drawing/2016/5/12/chartex" xmlns:cx7="http://schemas.microsoft.com/office/drawing/2016/5/13/chartex" xmlns:cx8="http://schemas.microsoft.com/office/drawing/2016/5/14/chartex" xmlns:mc="http://schemas.openxmlformats.org/markup-compatibility/2006" xmlns:m="http://schemas.openxmlformats.org/officeDocument/2006/math" xmlns:aink="http://schemas.microsoft.com/office/drawing/2016/ink" xmlns:am3d="http://schemas.microsoft.com/office/drawing/2017/model3d" xmlns:oel="http://schemas.microsoft.com/office/2019/extlst" xmlns:r="http://schemas.openxmlformats.org/officeDocument/2006/relationships" xmlns:wp14="http://schemas.microsoft.com/office/word/2010/wordprocessingDrawing" xmlns:wp="http://schemas.openxmlformats.org/drawingml/2006/wordprocessingDrawing" xmlns:wpg="http://schemas.microsoft.com/office/word/2010/wordprocessingGroup" xmlns:wpi="http://schemas.microsoft.com/office/word/2010/wordprocessingInk" xmlns:wps="http://schemas.microsoft.com/office/word/2010/wordprocessingShape" xmlns:o="urn:schemas-microsoft-com:office:office" xmlns:v="urn:schemas-microsoft-com:vml" xmlns:w10="urn:schemas-microsoft-com:office:word" xmlns:w="http://schemas.openxmlformats.org/wordprocessingml/2006/main" xmlns:w14="http://schemas.microsoft.com/office/word/2010/wordml" xmlns:w15="http://schemas.microsoft.com/office/word/2012/wordml" xmlns:w16cex="http://schemas.microsoft.com/office/word/2018/wordml/cex" xmlns:w16cid="http://schemas.microsoft.com/office/word/2016/wordml/cid" xmlns:w16="http://schemas.microsoft.com/office/word/2018/wordml" xmlns:w16sdtdh="http://schemas.microsoft.com/office/word/2020/wordml/sdtdatahash" xmlns:w16sdtfl="http://schemas.microsoft.com/office/word/2024/wordml/sdtformatlock" xmlns:w16se="http://schemas.microsoft.com/office/word/2015/wordml/symex" xmlns:w16du="http://schemas.microsoft.com/office/word/2023/wordml/word16du" xmlns:wne="http://schemas.microsoft.com/office/word/2006/wordml" mc:Ignorable="w14 w15 w16se w16cid w16 w16cex w16sdtdh w16sdtfl w16du wp14">
   <w:p>
     <w:pPr>
       <w:pBdr>
@@ -27914,13 +27947,13 @@
 </file>
 
 <file path=word/header7.xml><?xml version="1.0" encoding="utf-8"?>
-<w:hdr xmlns:wpc="http://schemas.microsoft.com/office/word/2010/wordprocessingCanvas" xmlns:cx="http://schemas.microsoft.com/office/drawing/2014/chartex" xmlns:cx1="http://schemas.microsoft.com/office/drawing/2015/9/8/chartex" xmlns:cx2="http://schemas.microsoft.com/office/drawing/2015/10/21/chartex" xmlns:cx3="http://schemas.microsoft.com/office/drawing/2016/5/9/chartex" xmlns:cx4="http://schemas.microsoft.com/office/drawing/2016/5/10/chartex" xmlns:cx5="http://schemas.microsoft.com/office/drawing/2016/5/11/chartex" xmlns:cx6="http://schemas.microsoft.com/office/drawing/2016/5/12/chartex" xmlns:cx7="http://schemas.microsoft.com/office/drawing/2016/5/13/chartex" xmlns:cx8="http://schemas.microsoft.com/office/drawing/2016/5/14/chartex" xmlns:mc="http://schemas.openxmlformats.org/markup-compatibility/2006" xmlns:aink="http://schemas.microsoft.com/office/drawing/2016/ink" xmlns:am3d="http://schemas.microsoft.com/office/drawing/2017/model3d" xmlns:o="urn:schemas-microsoft-com:office:office" xmlns:oel="http://schemas.microsoft.com/office/2019/extlst" xmlns:r="http://schemas.openxmlformats.org/officeDocument/2006/relationships" xmlns:m="http://schemas.openxmlformats.org/officeDocument/2006/math" xmlns:v="urn:schemas-microsoft-com:vml" xmlns:wp14="http://schemas.microsoft.com/office/word/2010/wordprocessingDrawing" xmlns:wp="http://schemas.openxmlformats.org/drawingml/2006/wordprocessingDrawing" xmlns:w10="urn:schemas-microsoft-com:office:word" xmlns:w="http://schemas.openxmlformats.org/wordprocessingml/2006/main" xmlns:w14="http://schemas.microsoft.com/office/word/2010/wordml" xmlns:w15="http://schemas.microsoft.com/office/word/2012/wordml" xmlns:w16cex="http://schemas.microsoft.com/office/word/2018/wordml/cex" xmlns:w16cid="http://schemas.microsoft.com/office/word/2016/wordml/cid" xmlns:w16="http://schemas.microsoft.com/office/word/2018/wordml" xmlns:w16du="http://schemas.microsoft.com/office/word/2023/wordml/word16du" xmlns:w16sdtdh="http://schemas.microsoft.com/office/word/2020/wordml/sdtdatahash" xmlns:w16sdtfl="http://schemas.microsoft.com/office/word/2024/wordml/sdtformatlock" xmlns:w16se="http://schemas.microsoft.com/office/word/2015/wordml/symex" xmlns:wpg="http://schemas.microsoft.com/office/word/2010/wordprocessingGroup" xmlns:wpi="http://schemas.microsoft.com/office/word/2010/wordprocessingInk" xmlns:wne="http://schemas.microsoft.com/office/word/2006/wordml" xmlns:wps="http://schemas.microsoft.com/office/word/2010/wordprocessingShape" mc:Ignorable="w14 w15 w16se w16cid w16 w16cex w16sdtdh w16sdtfl w16du wp14">
+<w:hdr xmlns:wpc="http://schemas.microsoft.com/office/word/2010/wordprocessingCanvas" xmlns:cx="http://schemas.microsoft.com/office/drawing/2014/chartex" xmlns:cx1="http://schemas.microsoft.com/office/drawing/2015/9/8/chartex" xmlns:cx2="http://schemas.microsoft.com/office/drawing/2015/10/21/chartex" xmlns:cx3="http://schemas.microsoft.com/office/drawing/2016/5/9/chartex" xmlns:cx4="http://schemas.microsoft.com/office/drawing/2016/5/10/chartex" xmlns:cx5="http://schemas.microsoft.com/office/drawing/2016/5/11/chartex" xmlns:cx6="http://schemas.microsoft.com/office/drawing/2016/5/12/chartex" xmlns:cx7="http://schemas.microsoft.com/office/drawing/2016/5/13/chartex" xmlns:cx8="http://schemas.microsoft.com/office/drawing/2016/5/14/chartex" xmlns:mc="http://schemas.openxmlformats.org/markup-compatibility/2006" xmlns:m="http://schemas.openxmlformats.org/officeDocument/2006/math" xmlns:aink="http://schemas.microsoft.com/office/drawing/2016/ink" xmlns:am3d="http://schemas.microsoft.com/office/drawing/2017/model3d" xmlns:oel="http://schemas.microsoft.com/office/2019/extlst" xmlns:r="http://schemas.openxmlformats.org/officeDocument/2006/relationships" xmlns:wp14="http://schemas.microsoft.com/office/word/2010/wordprocessingDrawing" xmlns:wp="http://schemas.openxmlformats.org/drawingml/2006/wordprocessingDrawing" xmlns:wpg="http://schemas.microsoft.com/office/word/2010/wordprocessingGroup" xmlns:wpi="http://schemas.microsoft.com/office/word/2010/wordprocessingInk" xmlns:wps="http://schemas.microsoft.com/office/word/2010/wordprocessingShape" xmlns:o="urn:schemas-microsoft-com:office:office" xmlns:v="urn:schemas-microsoft-com:vml" xmlns:w10="urn:schemas-microsoft-com:office:word" xmlns:w="http://schemas.openxmlformats.org/wordprocessingml/2006/main" xmlns:w14="http://schemas.microsoft.com/office/word/2010/wordml" xmlns:w15="http://schemas.microsoft.com/office/word/2012/wordml" xmlns:w16cex="http://schemas.microsoft.com/office/word/2018/wordml/cex" xmlns:w16cid="http://schemas.microsoft.com/office/word/2016/wordml/cid" xmlns:w16="http://schemas.microsoft.com/office/word/2018/wordml" xmlns:w16sdtdh="http://schemas.microsoft.com/office/word/2020/wordml/sdtdatahash" xmlns:w16sdtfl="http://schemas.microsoft.com/office/word/2024/wordml/sdtformatlock" xmlns:w16se="http://schemas.microsoft.com/office/word/2015/wordml/symex" xmlns:w16du="http://schemas.microsoft.com/office/word/2023/wordml/word16du" xmlns:wne="http://schemas.microsoft.com/office/word/2006/wordml" mc:Ignorable="w14 w15 w16se w16cid w16 w16cex w16sdtdh w16sdtfl w16du wp14">
   <w:p/>
 </w:hdr>
 </file>
 
 <file path=word/numbering.xml><?xml version="1.0" encoding="utf-8"?>
-<w:numbering xmlns:wpc="http://schemas.microsoft.com/office/word/2010/wordprocessingCanvas" xmlns:cx="http://schemas.microsoft.com/office/drawing/2014/chartex" xmlns:cx1="http://schemas.microsoft.com/office/drawing/2015/9/8/chartex" xmlns:cx2="http://schemas.microsoft.com/office/drawing/2015/10/21/chartex" xmlns:cx3="http://schemas.microsoft.com/office/drawing/2016/5/9/chartex" xmlns:cx4="http://schemas.microsoft.com/office/drawing/2016/5/10/chartex" xmlns:cx5="http://schemas.microsoft.com/office/drawing/2016/5/11/chartex" xmlns:cx6="http://schemas.microsoft.com/office/drawing/2016/5/12/chartex" xmlns:cx7="http://schemas.microsoft.com/office/drawing/2016/5/13/chartex" xmlns:cx8="http://schemas.microsoft.com/office/drawing/2016/5/14/chartex" xmlns:mc="http://schemas.openxmlformats.org/markup-compatibility/2006" xmlns:aink="http://schemas.microsoft.com/office/drawing/2016/ink" xmlns:am3d="http://schemas.microsoft.com/office/drawing/2017/model3d" xmlns:o="urn:schemas-microsoft-com:office:office" xmlns:oel="http://schemas.microsoft.com/office/2019/extlst" xmlns:r="http://schemas.openxmlformats.org/officeDocument/2006/relationships" xmlns:m="http://schemas.openxmlformats.org/officeDocument/2006/math" xmlns:v="urn:schemas-microsoft-com:vml" xmlns:wp14="http://schemas.microsoft.com/office/word/2010/wordprocessingDrawing" xmlns:wp="http://schemas.openxmlformats.org/drawingml/2006/wordprocessingDrawing" xmlns:w10="urn:schemas-microsoft-com:office:word" xmlns:w="http://schemas.openxmlformats.org/wordprocessingml/2006/main" xmlns:w14="http://schemas.microsoft.com/office/word/2010/wordml" xmlns:w15="http://schemas.microsoft.com/office/word/2012/wordml" xmlns:w16cex="http://schemas.microsoft.com/office/word/2018/wordml/cex" xmlns:w16cid="http://schemas.microsoft.com/office/word/2016/wordml/cid" xmlns:w16="http://schemas.microsoft.com/office/word/2018/wordml" xmlns:w16du="http://schemas.microsoft.com/office/word/2023/wordml/word16du" xmlns:w16sdtdh="http://schemas.microsoft.com/office/word/2020/wordml/sdtdatahash" xmlns:w16sdtfl="http://schemas.microsoft.com/office/word/2024/wordml/sdtformatlock" xmlns:w16se="http://schemas.microsoft.com/office/word/2015/wordml/symex" xmlns:wpg="http://schemas.microsoft.com/office/word/2010/wordprocessingGroup" xmlns:wpi="http://schemas.microsoft.com/office/word/2010/wordprocessingInk" xmlns:wne="http://schemas.microsoft.com/office/word/2006/wordml" xmlns:wps="http://schemas.microsoft.com/office/word/2010/wordprocessingShape" mc:Ignorable="w14 w15 w16se w16cid w16 w16cex w16sdtdh w16sdtfl w16du wp14">
+<w:numbering xmlns:wpc="http://schemas.microsoft.com/office/word/2010/wordprocessingCanvas" xmlns:cx="http://schemas.microsoft.com/office/drawing/2014/chartex" xmlns:cx1="http://schemas.microsoft.com/office/drawing/2015/9/8/chartex" xmlns:cx2="http://schemas.microsoft.com/office/drawing/2015/10/21/chartex" xmlns:cx3="http://schemas.microsoft.com/office/drawing/2016/5/9/chartex" xmlns:cx4="http://schemas.microsoft.com/office/drawing/2016/5/10/chartex" xmlns:cx5="http://schemas.microsoft.com/office/drawing/2016/5/11/chartex" xmlns:cx6="http://schemas.microsoft.com/office/drawing/2016/5/12/chartex" xmlns:cx7="http://schemas.microsoft.com/office/drawing/2016/5/13/chartex" xmlns:cx8="http://schemas.microsoft.com/office/drawing/2016/5/14/chartex" xmlns:mc="http://schemas.openxmlformats.org/markup-compatibility/2006" xmlns:m="http://schemas.openxmlformats.org/officeDocument/2006/math" xmlns:aink="http://schemas.microsoft.com/office/drawing/2016/ink" xmlns:am3d="http://schemas.microsoft.com/office/drawing/2017/model3d" xmlns:oel="http://schemas.microsoft.com/office/2019/extlst" xmlns:r="http://schemas.openxmlformats.org/officeDocument/2006/relationships" xmlns:wp14="http://schemas.microsoft.com/office/word/2010/wordprocessingDrawing" xmlns:wp="http://schemas.openxmlformats.org/drawingml/2006/wordprocessingDrawing" xmlns:wpg="http://schemas.microsoft.com/office/word/2010/wordprocessingGroup" xmlns:wpi="http://schemas.microsoft.com/office/word/2010/wordprocessingInk" xmlns:wps="http://schemas.microsoft.com/office/word/2010/wordprocessingShape" xmlns:o="urn:schemas-microsoft-com:office:office" xmlns:v="urn:schemas-microsoft-com:vml" xmlns:w10="urn:schemas-microsoft-com:office:word" xmlns:w="http://schemas.openxmlformats.org/wordprocessingml/2006/main" xmlns:w14="http://schemas.microsoft.com/office/word/2010/wordml" xmlns:w15="http://schemas.microsoft.com/office/word/2012/wordml" xmlns:w16cex="http://schemas.microsoft.com/office/word/2018/wordml/cex" xmlns:w16cid="http://schemas.microsoft.com/office/word/2016/wordml/cid" xmlns:w16="http://schemas.microsoft.com/office/word/2018/wordml" xmlns:w16sdtdh="http://schemas.microsoft.com/office/word/2020/wordml/sdtdatahash" xmlns:w16sdtfl="http://schemas.microsoft.com/office/word/2024/wordml/sdtformatlock" xmlns:w16se="http://schemas.microsoft.com/office/word/2015/wordml/symex" xmlns:w16du="http://schemas.microsoft.com/office/word/2023/wordml/word16du" xmlns:wne="http://schemas.microsoft.com/office/word/2006/wordml" mc:Ignorable="w14 w15 w16se w16cid w16 w16cex w16sdtdh w16sdtfl w16du wp14">
   <w:abstractNum w:abstractNumId="0" w15:restartNumberingAfterBreak="0">
     <w:nsid w:val="03EC15E1"/>
     <w:multiLevelType w:val="multilevel"/>
@@ -29388,7 +29421,7 @@
 </file>
 
 <file path=word/styles.xml><?xml version="1.0" encoding="utf-8"?>
-<w:styles xmlns:mc="http://schemas.openxmlformats.org/markup-compatibility/2006" xmlns:r="http://schemas.openxmlformats.org/officeDocument/2006/relationships" xmlns:w="http://schemas.openxmlformats.org/wordprocessingml/2006/main" xmlns:w14="http://schemas.microsoft.com/office/word/2010/wordml" xmlns:w15="http://schemas.microsoft.com/office/word/2012/wordml" xmlns:w16cex="http://schemas.microsoft.com/office/word/2018/wordml/cex" xmlns:w16cid="http://schemas.microsoft.com/office/word/2016/wordml/cid" xmlns:w16="http://schemas.microsoft.com/office/word/2018/wordml" xmlns:w16du="http://schemas.microsoft.com/office/word/2023/wordml/word16du" xmlns:w16sdtdh="http://schemas.microsoft.com/office/word/2020/wordml/sdtdatahash" xmlns:w16sdtfl="http://schemas.microsoft.com/office/word/2024/wordml/sdtformatlock" xmlns:w16se="http://schemas.microsoft.com/office/word/2015/wordml/symex" mc:Ignorable="w14 w15 w16se w16cid w16 w16cex w16sdtdh w16sdtfl w16du">
+<w:styles xmlns:mc="http://schemas.openxmlformats.org/markup-compatibility/2006" xmlns:r="http://schemas.openxmlformats.org/officeDocument/2006/relationships" xmlns:w="http://schemas.openxmlformats.org/wordprocessingml/2006/main" xmlns:w14="http://schemas.microsoft.com/office/word/2010/wordml" xmlns:w15="http://schemas.microsoft.com/office/word/2012/wordml" xmlns:w16cex="http://schemas.microsoft.com/office/word/2018/wordml/cex" xmlns:w16cid="http://schemas.microsoft.com/office/word/2016/wordml/cid" xmlns:w16="http://schemas.microsoft.com/office/word/2018/wordml" xmlns:w16sdtdh="http://schemas.microsoft.com/office/word/2020/wordml/sdtdatahash" xmlns:w16sdtfl="http://schemas.microsoft.com/office/word/2024/wordml/sdtformatlock" xmlns:w16se="http://schemas.microsoft.com/office/word/2015/wordml/symex" xmlns:w16du="http://schemas.microsoft.com/office/word/2023/wordml/word16du" mc:Ignorable="w14 w15 w16se w16cid w16 w16cex w16sdtdh w16sdtfl w16du">
   <w:docDefaults>
     <w:rPrDefault>
       <w:rPr>

</xml_diff>

<commit_message>
Update final Smart Sales project book
</commit_message>
<xml_diff>
--- a/output/ספר פרויקט גמר - Smart Sales - גרסה סופית.docx
+++ b/output/ספר פרויקט גמר - Smart Sales - גרסה סופית.docx
@@ -463,7 +463,6 @@
           </w:tcPr>
           <w:p>
             <w:pPr>
-              <w:bidi w:val="0"/>
               <w:spacing w:after="0" w:line="281" w:lineRule="auto"/>
               <w:jc w:val="center"/>
               <w:rPr>
@@ -656,7 +655,6 @@
           </w:tcPr>
           <w:p>
             <w:pPr>
-              <w:bidi w:val="0"/>
               <w:spacing w:after="0" w:line="281" w:lineRule="auto"/>
               <w:jc w:val="center"/>
               <w:rPr>
@@ -8607,7 +8605,7 @@
           <w:noProof/>
         </w:rPr>
         <w:drawing>
-          <wp:anchor distT="0" distB="0" distL="114300" distR="114300" simplePos="0" relativeHeight="251660288" behindDoc="1" locked="0" layoutInCell="1" allowOverlap="1" wp14:anchorId="206D17E8" wp14:editId="400DB1D9">
+          <wp:anchor distT="0" distB="0" distL="114300" distR="114300" simplePos="0" relativeHeight="251660288" behindDoc="1" locked="0" layoutInCell="1" allowOverlap="1" wp14:anchorId="206D17E8" wp14:editId="46D75755">
             <wp:simplePos x="0" y="0"/>
             <wp:positionH relativeFrom="column">
               <wp:posOffset>-17145</wp:posOffset>
@@ -8884,19 +8882,8 @@
         <w:t xml:space="preserve"> באמצעות ה-</w:t>
       </w:r>
       <w:r>
-        <w:t>SDK</w:t>
-      </w:r>
-      <w:r>
-        <w:rPr>
-          <w:rtl/>
-        </w:rPr>
-        <w:t xml:space="preserve"> ולשירותי צד שלישי באמצעות קריאות שרת-לשרת.</w:t>
-      </w:r>
-    </w:p>
-    <w:p>
-      <w:pPr>
-        <w:spacing w:before="120" w:after="80"/>
-      </w:pPr>
+        <w:t>SD</w:t>
+      </w:r>
       <w:r>
         <w:rPr>
           <w:noProof/>
@@ -8904,9 +8891,9 @@
         </w:rPr>
         <w:lastRenderedPageBreak/>
         <w:drawing>
-          <wp:inline distT="0" distB="0" distL="0" distR="0" wp14:anchorId="03B1C5CB" wp14:editId="55FDB35E">
-            <wp:extent cx="6191250" cy="3362325"/>
-            <wp:effectExtent l="0" t="0" r="0" b="0"/>
+          <wp:inline distT="0" distB="0" distL="0" distR="0" wp14:anchorId="11487C8C" wp14:editId="7B98F88B">
+            <wp:extent cx="5760720" cy="3128514"/>
+            <wp:effectExtent l="0" t="0" r="5080" b="0"/>
             <wp:docPr id="5" name="תמונה 1715509428"/>
             <wp:cNvGraphicFramePr>
               <a:graphicFrameLocks xmlns:a="http://schemas.openxmlformats.org/drawingml/2006/main" noChangeAspect="1"/>
@@ -8929,7 +8916,7 @@
                   <pic:spPr bwMode="auto">
                     <a:xfrm>
                       <a:off x="0" y="0"/>
-                      <a:ext cx="6191250" cy="3362325"/>
+                      <a:ext cx="5760720" cy="3128514"/>
                     </a:xfrm>
                     <a:prstGeom prst="rect">
                       <a:avLst/>
@@ -8942,6 +8929,20 @@
           </wp:inline>
         </w:drawing>
       </w:r>
+      <w:r>
+        <w:t>K</w:t>
+      </w:r>
+      <w:r>
+        <w:rPr>
+          <w:rtl/>
+        </w:rPr>
+        <w:t xml:space="preserve"> ולשירותי צד שלישי באמצעות קריאות שרת-לשרת.</w:t>
+      </w:r>
+    </w:p>
+    <w:p>
+      <w:pPr>
+        <w:spacing w:before="120" w:after="80"/>
+      </w:pPr>
     </w:p>
     <w:p>
       <w:pPr>
@@ -19238,7 +19239,11 @@
         <w:t xml:space="preserve"> תכנית עבודה - </w:t>
       </w:r>
       <w:r>
-        <w:t>300</w:t>
+        <w:rPr>
+          <w:rFonts w:hint="cs"/>
+          <w:rtl/>
+        </w:rPr>
+        <w:t>550</w:t>
       </w:r>
       <w:r>
         <w:rPr>
@@ -19445,10 +19450,12 @@
             </w:pPr>
             <w:r>
               <w:rPr>
-                <w:sz w:val="19"/>
-                <w:szCs w:val="19"/>
-              </w:rPr>
-              <w:t>35</w:t>
+                <w:rFonts w:hint="cs"/>
+                <w:sz w:val="19"/>
+                <w:szCs w:val="19"/>
+                <w:rtl/>
+              </w:rPr>
+              <w:t>70</w:t>
             </w:r>
           </w:p>
         </w:tc>
@@ -19532,10 +19539,12 @@
             </w:pPr>
             <w:r>
               <w:rPr>
-                <w:sz w:val="19"/>
-                <w:szCs w:val="19"/>
-              </w:rPr>
-              <w:t>40</w:t>
+                <w:rFonts w:hint="cs"/>
+                <w:sz w:val="19"/>
+                <w:szCs w:val="19"/>
+                <w:rtl/>
+              </w:rPr>
+              <w:t>80</w:t>
             </w:r>
           </w:p>
         </w:tc>
@@ -19645,10 +19654,12 @@
             </w:pPr>
             <w:r>
               <w:rPr>
-                <w:sz w:val="19"/>
-                <w:szCs w:val="19"/>
-              </w:rPr>
-              <w:t>45</w:t>
+                <w:rFonts w:hint="cs"/>
+                <w:sz w:val="19"/>
+                <w:szCs w:val="19"/>
+                <w:rtl/>
+              </w:rPr>
+              <w:t>90</w:t>
             </w:r>
           </w:p>
         </w:tc>
@@ -19725,10 +19736,12 @@
             </w:pPr>
             <w:r>
               <w:rPr>
-                <w:sz w:val="19"/>
-                <w:szCs w:val="19"/>
-              </w:rPr>
-              <w:t>60</w:t>
+                <w:rFonts w:hint="cs"/>
+                <w:sz w:val="19"/>
+                <w:szCs w:val="19"/>
+                <w:rtl/>
+              </w:rPr>
+              <w:t>95</w:t>
             </w:r>
           </w:p>
         </w:tc>
@@ -19805,10 +19818,12 @@
             </w:pPr>
             <w:r>
               <w:rPr>
-                <w:sz w:val="19"/>
-                <w:szCs w:val="19"/>
-              </w:rPr>
-              <w:t>35</w:t>
+                <w:rFonts w:hint="cs"/>
+                <w:sz w:val="19"/>
+                <w:szCs w:val="19"/>
+                <w:rtl/>
+              </w:rPr>
+              <w:t>70</w:t>
             </w:r>
           </w:p>
         </w:tc>
@@ -19892,10 +19907,12 @@
             </w:pPr>
             <w:r>
               <w:rPr>
-                <w:sz w:val="19"/>
-                <w:szCs w:val="19"/>
-              </w:rPr>
-              <w:t>30</w:t>
+                <w:rFonts w:hint="cs"/>
+                <w:sz w:val="19"/>
+                <w:szCs w:val="19"/>
+                <w:rtl/>
+              </w:rPr>
+              <w:t>60</w:t>
             </w:r>
           </w:p>
         </w:tc>
@@ -20001,10 +20018,12 @@
             </w:pPr>
             <w:r>
               <w:rPr>
-                <w:sz w:val="19"/>
-                <w:szCs w:val="19"/>
-              </w:rPr>
-              <w:t>30</w:t>
+                <w:rFonts w:hint="cs"/>
+                <w:sz w:val="19"/>
+                <w:szCs w:val="19"/>
+                <w:rtl/>
+              </w:rPr>
+              <w:t>60</w:t>
             </w:r>
           </w:p>
         </w:tc>
@@ -20088,8 +20107,10 @@
             </w:pPr>
             <w:r>
               <w:rPr>
-                <w:sz w:val="19"/>
-                <w:szCs w:val="19"/>
+                <w:rFonts w:hint="cs"/>
+                <w:sz w:val="19"/>
+                <w:szCs w:val="19"/>
+                <w:rtl/>
               </w:rPr>
               <w:t>25</w:t>
             </w:r>
@@ -23315,12 +23336,10 @@
     <w:p>
       <w:pPr>
         <w:sectPr>
-          <w:headerReference w:type="even" r:id="rId24"/>
-          <w:headerReference w:type="default" r:id="rId25"/>
-          <w:footerReference w:type="even" r:id="rId26"/>
-          <w:footerReference w:type="default" r:id="rId27"/>
-          <w:headerReference w:type="first" r:id="rId28"/>
-          <w:footerReference w:type="first" r:id="rId29"/>
+          <w:headerReference w:type="default" r:id="rId24"/>
+          <w:footerReference w:type="default" r:id="rId25"/>
+          <w:headerReference w:type="first" r:id="rId26"/>
+          <w:footerReference w:type="first" r:id="rId27"/>
           <w:pgSz w:w="11906" w:h="16838"/>
           <w:pgMar w:top="1417" w:right="1417" w:bottom="1417" w:left="1417" w:header="708" w:footer="708" w:gutter="0"/>
           <w:pgNumType w:start="1"/>
@@ -23390,7 +23409,7 @@
                     </pic:cNvPicPr>
                   </pic:nvPicPr>
                   <pic:blipFill rotWithShape="1">
-                    <a:blip r:embed="rId30" cstate="print">
+                    <a:blip r:embed="rId28" cstate="print">
                       <a:extLst>
                         <a:ext uri="{28A0092B-C50C-407E-A947-70E740481C1C}">
                           <a14:useLocalDpi xmlns:a14="http://schemas.microsoft.com/office/drawing/2010/main" val="0"/>
@@ -23509,10 +23528,10 @@
       <w:pPr>
         <w:spacing w:line="276" w:lineRule="auto"/>
         <w:sectPr>
-          <w:headerReference w:type="default" r:id="rId31"/>
-          <w:footerReference w:type="default" r:id="rId32"/>
-          <w:headerReference w:type="first" r:id="rId33"/>
-          <w:footerReference w:type="first" r:id="rId34"/>
+          <w:headerReference w:type="default" r:id="rId29"/>
+          <w:footerReference w:type="default" r:id="rId30"/>
+          <w:headerReference w:type="first" r:id="rId31"/>
+          <w:footerReference w:type="first" r:id="rId32"/>
           <w:pgSz w:w="11906" w:h="16838" w:code="9"/>
           <w:pgMar w:top="936" w:right="936" w:bottom="936" w:left="936" w:header="708" w:footer="708" w:gutter="0"/>
           <w:cols w:space="720"/>
@@ -27407,10 +27426,10 @@
       </w:r>
     </w:p>
     <w:sectPr>
-      <w:headerReference w:type="default" r:id="rId35"/>
-      <w:footerReference w:type="default" r:id="rId36"/>
-      <w:headerReference w:type="first" r:id="rId37"/>
-      <w:footerReference w:type="first" r:id="rId38"/>
+      <w:headerReference w:type="default" r:id="rId33"/>
+      <w:footerReference w:type="default" r:id="rId34"/>
+      <w:headerReference w:type="first" r:id="rId35"/>
+      <w:footerReference w:type="first" r:id="rId36"/>
       <w:pgSz w:w="11906" w:h="16838"/>
       <w:pgMar w:top="1152" w:right="1224" w:bottom="1152" w:left="1224" w:header="708" w:footer="708" w:gutter="0"/>
       <w:cols w:space="720"/>
@@ -27451,8 +27470,73 @@
 <w:ftr xmlns:wpc="http://schemas.microsoft.com/office/word/2010/wordprocessingCanvas" xmlns:cx="http://schemas.microsoft.com/office/drawing/2014/chartex" xmlns:cx1="http://schemas.microsoft.com/office/drawing/2015/9/8/chartex" xmlns:cx2="http://schemas.microsoft.com/office/drawing/2015/10/21/chartex" xmlns:cx3="http://schemas.microsoft.com/office/drawing/2016/5/9/chartex" xmlns:cx4="http://schemas.microsoft.com/office/drawing/2016/5/10/chartex" xmlns:cx5="http://schemas.microsoft.com/office/drawing/2016/5/11/chartex" xmlns:cx6="http://schemas.microsoft.com/office/drawing/2016/5/12/chartex" xmlns:cx7="http://schemas.microsoft.com/office/drawing/2016/5/13/chartex" xmlns:cx8="http://schemas.microsoft.com/office/drawing/2016/5/14/chartex" xmlns:mc="http://schemas.openxmlformats.org/markup-compatibility/2006" xmlns:m="http://schemas.openxmlformats.org/officeDocument/2006/math" xmlns:aink="http://schemas.microsoft.com/office/drawing/2016/ink" xmlns:am3d="http://schemas.microsoft.com/office/drawing/2017/model3d" xmlns:oel="http://schemas.microsoft.com/office/2019/extlst" xmlns:r="http://schemas.openxmlformats.org/officeDocument/2006/relationships" xmlns:wp14="http://schemas.microsoft.com/office/word/2010/wordprocessingDrawing" xmlns:wp="http://schemas.openxmlformats.org/drawingml/2006/wordprocessingDrawing" xmlns:wpg="http://schemas.microsoft.com/office/word/2010/wordprocessingGroup" xmlns:wpi="http://schemas.microsoft.com/office/word/2010/wordprocessingInk" xmlns:wps="http://schemas.microsoft.com/office/word/2010/wordprocessingShape" xmlns:o="urn:schemas-microsoft-com:office:office" xmlns:v="urn:schemas-microsoft-com:vml" xmlns:w10="urn:schemas-microsoft-com:office:word" xmlns:w="http://schemas.openxmlformats.org/wordprocessingml/2006/main" xmlns:w14="http://schemas.microsoft.com/office/word/2010/wordml" xmlns:w15="http://schemas.microsoft.com/office/word/2012/wordml" xmlns:w16cex="http://schemas.microsoft.com/office/word/2018/wordml/cex" xmlns:w16cid="http://schemas.microsoft.com/office/word/2016/wordml/cid" xmlns:w16="http://schemas.microsoft.com/office/word/2018/wordml" xmlns:w16sdtdh="http://schemas.microsoft.com/office/word/2020/wordml/sdtdatahash" xmlns:w16sdtfl="http://schemas.microsoft.com/office/word/2024/wordml/sdtformatlock" xmlns:w16se="http://schemas.microsoft.com/office/word/2015/wordml/symex" xmlns:w16du="http://schemas.microsoft.com/office/word/2023/wordml/word16du" xmlns:wne="http://schemas.microsoft.com/office/word/2006/wordml" mc:Ignorable="w14 w15 w16se w16cid w16 w16cex w16sdtdh w16sdtfl w16du wp14">
   <w:p>
     <w:pPr>
-      <w:pStyle w:val="af"/>
+      <w:jc w:val="center"/>
     </w:pPr>
+    <w:proofErr w:type="spellStart"/>
+    <w:r>
+      <w:rPr>
+        <w:color w:val="5B6573"/>
+        <w:sz w:val="18"/>
+        <w:szCs w:val="18"/>
+        <w:rtl/>
+      </w:rPr>
+      <w:t>מה״ט</w:t>
+    </w:r>
+    <w:proofErr w:type="spellEnd"/>
+    <w:r>
+      <w:rPr>
+        <w:color w:val="5B6573"/>
+        <w:sz w:val="18"/>
+        <w:szCs w:val="18"/>
+        <w:rtl/>
+      </w:rPr>
+      <w:t xml:space="preserve"> - הנדסת תוכנה  |  </w:t>
+    </w:r>
+    <w:r>
+      <w:rPr>
+        <w:color w:val="5B6573"/>
+        <w:sz w:val="18"/>
+        <w:szCs w:val="18"/>
+        <w:rtl/>
+      </w:rPr>
+      <w:fldChar w:fldCharType="begin"/>
+    </w:r>
+    <w:r>
+      <w:rPr>
+        <w:color w:val="5B6573"/>
+        <w:sz w:val="18"/>
+        <w:szCs w:val="18"/>
+        <w:rtl/>
+      </w:rPr>
+      <w:instrText xml:space="preserve"> PAGE </w:instrText>
+    </w:r>
+    <w:r>
+      <w:rPr>
+        <w:color w:val="5B6573"/>
+        <w:sz w:val="18"/>
+        <w:szCs w:val="18"/>
+        <w:rtl/>
+      </w:rPr>
+      <w:fldChar w:fldCharType="separate"/>
+    </w:r>
+    <w:r>
+      <w:rPr>
+        <w:color w:val="5B6573"/>
+        <w:sz w:val="18"/>
+        <w:szCs w:val="18"/>
+        <w:rtl/>
+      </w:rPr>
+      <w:t>34</w:t>
+    </w:r>
+    <w:r>
+      <w:rPr>
+        <w:color w:val="5B6573"/>
+        <w:sz w:val="18"/>
+        <w:szCs w:val="18"/>
+        <w:rtl/>
+      </w:rPr>
+      <w:fldChar w:fldCharType="end"/>
+    </w:r>
   </w:p>
 </w:ftr>
 </file>
@@ -27592,7 +27676,7 @@
         <w:szCs w:val="18"/>
         <w:rtl/>
       </w:rPr>
-      <w:t>34</w:t>
+      <w:t>35</w:t>
     </w:r>
     <w:r>
       <w:rPr>
@@ -27609,86 +27693,11 @@
 
 <file path=word/footer4.xml><?xml version="1.0" encoding="utf-8"?>
 <w:ftr xmlns:wpc="http://schemas.microsoft.com/office/word/2010/wordprocessingCanvas" xmlns:cx="http://schemas.microsoft.com/office/drawing/2014/chartex" xmlns:cx1="http://schemas.microsoft.com/office/drawing/2015/9/8/chartex" xmlns:cx2="http://schemas.microsoft.com/office/drawing/2015/10/21/chartex" xmlns:cx3="http://schemas.microsoft.com/office/drawing/2016/5/9/chartex" xmlns:cx4="http://schemas.microsoft.com/office/drawing/2016/5/10/chartex" xmlns:cx5="http://schemas.microsoft.com/office/drawing/2016/5/11/chartex" xmlns:cx6="http://schemas.microsoft.com/office/drawing/2016/5/12/chartex" xmlns:cx7="http://schemas.microsoft.com/office/drawing/2016/5/13/chartex" xmlns:cx8="http://schemas.microsoft.com/office/drawing/2016/5/14/chartex" xmlns:mc="http://schemas.openxmlformats.org/markup-compatibility/2006" xmlns:m="http://schemas.openxmlformats.org/officeDocument/2006/math" xmlns:aink="http://schemas.microsoft.com/office/drawing/2016/ink" xmlns:am3d="http://schemas.microsoft.com/office/drawing/2017/model3d" xmlns:oel="http://schemas.microsoft.com/office/2019/extlst" xmlns:r="http://schemas.openxmlformats.org/officeDocument/2006/relationships" xmlns:wp14="http://schemas.microsoft.com/office/word/2010/wordprocessingDrawing" xmlns:wp="http://schemas.openxmlformats.org/drawingml/2006/wordprocessingDrawing" xmlns:wpg="http://schemas.microsoft.com/office/word/2010/wordprocessingGroup" xmlns:wpi="http://schemas.microsoft.com/office/word/2010/wordprocessingInk" xmlns:wps="http://schemas.microsoft.com/office/word/2010/wordprocessingShape" xmlns:o="urn:schemas-microsoft-com:office:office" xmlns:v="urn:schemas-microsoft-com:vml" xmlns:w10="urn:schemas-microsoft-com:office:word" xmlns:w="http://schemas.openxmlformats.org/wordprocessingml/2006/main" xmlns:w14="http://schemas.microsoft.com/office/word/2010/wordml" xmlns:w15="http://schemas.microsoft.com/office/word/2012/wordml" xmlns:w16cex="http://schemas.microsoft.com/office/word/2018/wordml/cex" xmlns:w16cid="http://schemas.microsoft.com/office/word/2016/wordml/cid" xmlns:w16="http://schemas.microsoft.com/office/word/2018/wordml" xmlns:w16sdtdh="http://schemas.microsoft.com/office/word/2020/wordml/sdtdatahash" xmlns:w16sdtfl="http://schemas.microsoft.com/office/word/2024/wordml/sdtformatlock" xmlns:w16se="http://schemas.microsoft.com/office/word/2015/wordml/symex" xmlns:w16du="http://schemas.microsoft.com/office/word/2023/wordml/word16du" xmlns:wne="http://schemas.microsoft.com/office/word/2006/wordml" mc:Ignorable="w14 w15 w16se w16cid w16 w16cex w16sdtdh w16sdtfl w16du wp14">
-  <w:p>
-    <w:pPr>
-      <w:jc w:val="center"/>
-    </w:pPr>
-    <w:proofErr w:type="spellStart"/>
-    <w:r>
-      <w:rPr>
-        <w:color w:val="5B6573"/>
-        <w:sz w:val="18"/>
-        <w:szCs w:val="18"/>
-        <w:rtl/>
-      </w:rPr>
-      <w:t>מה״ט</w:t>
-    </w:r>
-    <w:proofErr w:type="spellEnd"/>
-    <w:r>
-      <w:rPr>
-        <w:color w:val="5B6573"/>
-        <w:sz w:val="18"/>
-        <w:szCs w:val="18"/>
-        <w:rtl/>
-      </w:rPr>
-      <w:t xml:space="preserve"> - הנדסת תוכנה  |  </w:t>
-    </w:r>
-    <w:r>
-      <w:rPr>
-        <w:color w:val="5B6573"/>
-        <w:sz w:val="18"/>
-        <w:szCs w:val="18"/>
-        <w:rtl/>
-      </w:rPr>
-      <w:fldChar w:fldCharType="begin"/>
-    </w:r>
-    <w:r>
-      <w:rPr>
-        <w:color w:val="5B6573"/>
-        <w:sz w:val="18"/>
-        <w:szCs w:val="18"/>
-        <w:rtl/>
-      </w:rPr>
-      <w:instrText xml:space="preserve"> PAGE </w:instrText>
-    </w:r>
-    <w:r>
-      <w:rPr>
-        <w:color w:val="5B6573"/>
-        <w:sz w:val="18"/>
-        <w:szCs w:val="18"/>
-        <w:rtl/>
-      </w:rPr>
-      <w:fldChar w:fldCharType="separate"/>
-    </w:r>
-    <w:r>
-      <w:rPr>
-        <w:color w:val="5B6573"/>
-        <w:sz w:val="18"/>
-        <w:szCs w:val="18"/>
-        <w:rtl/>
-      </w:rPr>
-      <w:t>35</w:t>
-    </w:r>
-    <w:r>
-      <w:rPr>
-        <w:color w:val="5B6573"/>
-        <w:sz w:val="18"/>
-        <w:szCs w:val="18"/>
-        <w:rtl/>
-      </w:rPr>
-      <w:fldChar w:fldCharType="end"/>
-    </w:r>
-  </w:p>
+  <w:p/>
 </w:ftr>
 </file>
 
 <file path=word/footer5.xml><?xml version="1.0" encoding="utf-8"?>
-<w:ftr xmlns:wpc="http://schemas.microsoft.com/office/word/2010/wordprocessingCanvas" xmlns:cx="http://schemas.microsoft.com/office/drawing/2014/chartex" xmlns:cx1="http://schemas.microsoft.com/office/drawing/2015/9/8/chartex" xmlns:cx2="http://schemas.microsoft.com/office/drawing/2015/10/21/chartex" xmlns:cx3="http://schemas.microsoft.com/office/drawing/2016/5/9/chartex" xmlns:cx4="http://schemas.microsoft.com/office/drawing/2016/5/10/chartex" xmlns:cx5="http://schemas.microsoft.com/office/drawing/2016/5/11/chartex" xmlns:cx6="http://schemas.microsoft.com/office/drawing/2016/5/12/chartex" xmlns:cx7="http://schemas.microsoft.com/office/drawing/2016/5/13/chartex" xmlns:cx8="http://schemas.microsoft.com/office/drawing/2016/5/14/chartex" xmlns:mc="http://schemas.openxmlformats.org/markup-compatibility/2006" xmlns:m="http://schemas.openxmlformats.org/officeDocument/2006/math" xmlns:aink="http://schemas.microsoft.com/office/drawing/2016/ink" xmlns:am3d="http://schemas.microsoft.com/office/drawing/2017/model3d" xmlns:oel="http://schemas.microsoft.com/office/2019/extlst" xmlns:r="http://schemas.openxmlformats.org/officeDocument/2006/relationships" xmlns:wp14="http://schemas.microsoft.com/office/word/2010/wordprocessingDrawing" xmlns:wp="http://schemas.openxmlformats.org/drawingml/2006/wordprocessingDrawing" xmlns:wpg="http://schemas.microsoft.com/office/word/2010/wordprocessingGroup" xmlns:wpi="http://schemas.microsoft.com/office/word/2010/wordprocessingInk" xmlns:wps="http://schemas.microsoft.com/office/word/2010/wordprocessingShape" xmlns:o="urn:schemas-microsoft-com:office:office" xmlns:v="urn:schemas-microsoft-com:vml" xmlns:w10="urn:schemas-microsoft-com:office:word" xmlns:w="http://schemas.openxmlformats.org/wordprocessingml/2006/main" xmlns:w14="http://schemas.microsoft.com/office/word/2010/wordml" xmlns:w15="http://schemas.microsoft.com/office/word/2012/wordml" xmlns:w16cex="http://schemas.microsoft.com/office/word/2018/wordml/cex" xmlns:w16cid="http://schemas.microsoft.com/office/word/2016/wordml/cid" xmlns:w16="http://schemas.microsoft.com/office/word/2018/wordml" xmlns:w16sdtdh="http://schemas.microsoft.com/office/word/2020/wordml/sdtdatahash" xmlns:w16sdtfl="http://schemas.microsoft.com/office/word/2024/wordml/sdtformatlock" xmlns:w16se="http://schemas.microsoft.com/office/word/2015/wordml/symex" xmlns:w16du="http://schemas.microsoft.com/office/word/2023/wordml/word16du" xmlns:wne="http://schemas.microsoft.com/office/word/2006/wordml" mc:Ignorable="w14 w15 w16se w16cid w16 w16cex w16sdtdh w16sdtfl w16du wp14">
-  <w:p/>
-</w:ftr>
-</file>
-
-<file path=word/footer6.xml><?xml version="1.0" encoding="utf-8"?>
 <w:ftr xmlns:wpc="http://schemas.microsoft.com/office/word/2010/wordprocessingCanvas" xmlns:cx="http://schemas.microsoft.com/office/drawing/2014/chartex" xmlns:cx1="http://schemas.microsoft.com/office/drawing/2015/9/8/chartex" xmlns:cx2="http://schemas.microsoft.com/office/drawing/2015/10/21/chartex" xmlns:cx3="http://schemas.microsoft.com/office/drawing/2016/5/9/chartex" xmlns:cx4="http://schemas.microsoft.com/office/drawing/2016/5/10/chartex" xmlns:cx5="http://schemas.microsoft.com/office/drawing/2016/5/11/chartex" xmlns:cx6="http://schemas.microsoft.com/office/drawing/2016/5/12/chartex" xmlns:cx7="http://schemas.microsoft.com/office/drawing/2016/5/13/chartex" xmlns:cx8="http://schemas.microsoft.com/office/drawing/2016/5/14/chartex" xmlns:mc="http://schemas.openxmlformats.org/markup-compatibility/2006" xmlns:m="http://schemas.openxmlformats.org/officeDocument/2006/math" xmlns:aink="http://schemas.microsoft.com/office/drawing/2016/ink" xmlns:am3d="http://schemas.microsoft.com/office/drawing/2017/model3d" xmlns:oel="http://schemas.microsoft.com/office/2019/extlst" xmlns:r="http://schemas.openxmlformats.org/officeDocument/2006/relationships" xmlns:wp14="http://schemas.microsoft.com/office/word/2010/wordprocessingDrawing" xmlns:wp="http://schemas.openxmlformats.org/drawingml/2006/wordprocessingDrawing" xmlns:wpg="http://schemas.microsoft.com/office/word/2010/wordprocessingGroup" xmlns:wpi="http://schemas.microsoft.com/office/word/2010/wordprocessingInk" xmlns:wps="http://schemas.microsoft.com/office/word/2010/wordprocessingShape" xmlns:o="urn:schemas-microsoft-com:office:office" xmlns:v="urn:schemas-microsoft-com:vml" xmlns:w10="urn:schemas-microsoft-com:office:word" xmlns:w="http://schemas.openxmlformats.org/wordprocessingml/2006/main" xmlns:w14="http://schemas.microsoft.com/office/word/2010/wordml" xmlns:w15="http://schemas.microsoft.com/office/word/2012/wordml" xmlns:w16cex="http://schemas.microsoft.com/office/word/2018/wordml/cex" xmlns:w16cid="http://schemas.microsoft.com/office/word/2016/wordml/cid" xmlns:w16="http://schemas.microsoft.com/office/word/2018/wordml" xmlns:w16sdtdh="http://schemas.microsoft.com/office/word/2020/wordml/sdtdatahash" xmlns:w16sdtfl="http://schemas.microsoft.com/office/word/2024/wordml/sdtformatlock" xmlns:w16se="http://schemas.microsoft.com/office/word/2015/wordml/symex" xmlns:w16du="http://schemas.microsoft.com/office/word/2023/wordml/word16du" xmlns:wne="http://schemas.microsoft.com/office/word/2006/wordml" mc:Ignorable="w14 w15 w16se w16cid w16 w16cex w16sdtdh w16sdtfl w16du wp14">
   <w:p>
     <w:pPr>
@@ -27763,7 +27772,7 @@
 </w:ftr>
 </file>
 
-<file path=word/footer7.xml><?xml version="1.0" encoding="utf-8"?>
+<file path=word/footer6.xml><?xml version="1.0" encoding="utf-8"?>
 <w:ftr xmlns:wpc="http://schemas.microsoft.com/office/word/2010/wordprocessingCanvas" xmlns:cx="http://schemas.microsoft.com/office/drawing/2014/chartex" xmlns:cx1="http://schemas.microsoft.com/office/drawing/2015/9/8/chartex" xmlns:cx2="http://schemas.microsoft.com/office/drawing/2015/10/21/chartex" xmlns:cx3="http://schemas.microsoft.com/office/drawing/2016/5/9/chartex" xmlns:cx4="http://schemas.microsoft.com/office/drawing/2016/5/10/chartex" xmlns:cx5="http://schemas.microsoft.com/office/drawing/2016/5/11/chartex" xmlns:cx6="http://schemas.microsoft.com/office/drawing/2016/5/12/chartex" xmlns:cx7="http://schemas.microsoft.com/office/drawing/2016/5/13/chartex" xmlns:cx8="http://schemas.microsoft.com/office/drawing/2016/5/14/chartex" xmlns:mc="http://schemas.openxmlformats.org/markup-compatibility/2006" xmlns:m="http://schemas.openxmlformats.org/officeDocument/2006/math" xmlns:aink="http://schemas.microsoft.com/office/drawing/2016/ink" xmlns:am3d="http://schemas.microsoft.com/office/drawing/2017/model3d" xmlns:oel="http://schemas.microsoft.com/office/2019/extlst" xmlns:r="http://schemas.openxmlformats.org/officeDocument/2006/relationships" xmlns:wp14="http://schemas.microsoft.com/office/word/2010/wordprocessingDrawing" xmlns:wp="http://schemas.openxmlformats.org/drawingml/2006/wordprocessingDrawing" xmlns:wpg="http://schemas.microsoft.com/office/word/2010/wordprocessingGroup" xmlns:wpi="http://schemas.microsoft.com/office/word/2010/wordprocessingInk" xmlns:wps="http://schemas.microsoft.com/office/word/2010/wordprocessingShape" xmlns:o="urn:schemas-microsoft-com:office:office" xmlns:v="urn:schemas-microsoft-com:vml" xmlns:w10="urn:schemas-microsoft-com:office:word" xmlns:w="http://schemas.openxmlformats.org/wordprocessingml/2006/main" xmlns:w14="http://schemas.microsoft.com/office/word/2010/wordml" xmlns:w15="http://schemas.microsoft.com/office/word/2012/wordml" xmlns:w16cex="http://schemas.microsoft.com/office/word/2018/wordml/cex" xmlns:w16cid="http://schemas.microsoft.com/office/word/2016/wordml/cid" xmlns:w16="http://schemas.microsoft.com/office/word/2018/wordml" xmlns:w16sdtdh="http://schemas.microsoft.com/office/word/2020/wordml/sdtdatahash" xmlns:w16sdtfl="http://schemas.microsoft.com/office/word/2024/wordml/sdtformatlock" xmlns:w16se="http://schemas.microsoft.com/office/word/2015/wordml/symex" xmlns:w16du="http://schemas.microsoft.com/office/word/2023/wordml/word16du" xmlns:wne="http://schemas.microsoft.com/office/word/2006/wordml" mc:Ignorable="w14 w15 w16se w16cid w16 w16cex w16sdtdh w16sdtfl w16du wp14">
   <w:p/>
 </w:ftr>
@@ -27798,8 +27807,42 @@
 <w:hdr xmlns:wpc="http://schemas.microsoft.com/office/word/2010/wordprocessingCanvas" xmlns:cx="http://schemas.microsoft.com/office/drawing/2014/chartex" xmlns:cx1="http://schemas.microsoft.com/office/drawing/2015/9/8/chartex" xmlns:cx2="http://schemas.microsoft.com/office/drawing/2015/10/21/chartex" xmlns:cx3="http://schemas.microsoft.com/office/drawing/2016/5/9/chartex" xmlns:cx4="http://schemas.microsoft.com/office/drawing/2016/5/10/chartex" xmlns:cx5="http://schemas.microsoft.com/office/drawing/2016/5/11/chartex" xmlns:cx6="http://schemas.microsoft.com/office/drawing/2016/5/12/chartex" xmlns:cx7="http://schemas.microsoft.com/office/drawing/2016/5/13/chartex" xmlns:cx8="http://schemas.microsoft.com/office/drawing/2016/5/14/chartex" xmlns:mc="http://schemas.openxmlformats.org/markup-compatibility/2006" xmlns:m="http://schemas.openxmlformats.org/officeDocument/2006/math" xmlns:aink="http://schemas.microsoft.com/office/drawing/2016/ink" xmlns:am3d="http://schemas.microsoft.com/office/drawing/2017/model3d" xmlns:oel="http://schemas.microsoft.com/office/2019/extlst" xmlns:r="http://schemas.openxmlformats.org/officeDocument/2006/relationships" xmlns:wp14="http://schemas.microsoft.com/office/word/2010/wordprocessingDrawing" xmlns:wp="http://schemas.openxmlformats.org/drawingml/2006/wordprocessingDrawing" xmlns:wpg="http://schemas.microsoft.com/office/word/2010/wordprocessingGroup" xmlns:wpi="http://schemas.microsoft.com/office/word/2010/wordprocessingInk" xmlns:wps="http://schemas.microsoft.com/office/word/2010/wordprocessingShape" xmlns:o="urn:schemas-microsoft-com:office:office" xmlns:v="urn:schemas-microsoft-com:vml" xmlns:w10="urn:schemas-microsoft-com:office:word" xmlns:w="http://schemas.openxmlformats.org/wordprocessingml/2006/main" xmlns:w14="http://schemas.microsoft.com/office/word/2010/wordml" xmlns:w15="http://schemas.microsoft.com/office/word/2012/wordml" xmlns:w16cex="http://schemas.microsoft.com/office/word/2018/wordml/cex" xmlns:w16cid="http://schemas.microsoft.com/office/word/2016/wordml/cid" xmlns:w16="http://schemas.microsoft.com/office/word/2018/wordml" xmlns:w16sdtdh="http://schemas.microsoft.com/office/word/2020/wordml/sdtdatahash" xmlns:w16sdtfl="http://schemas.microsoft.com/office/word/2024/wordml/sdtformatlock" xmlns:w16se="http://schemas.microsoft.com/office/word/2015/wordml/symex" xmlns:w16du="http://schemas.microsoft.com/office/word/2023/wordml/word16du" xmlns:wne="http://schemas.microsoft.com/office/word/2006/wordml" mc:Ignorable="w14 w15 w16se w16cid w16 w16cex w16sdtdh w16sdtfl w16du wp14">
   <w:p>
     <w:pPr>
-      <w:pStyle w:val="ad"/>
+      <w:pBdr>
+        <w:bottom w:val="single" w:sz="4" w:space="0" w:color="D7DEE7"/>
+      </w:pBdr>
+      <w:jc w:val="right"/>
     </w:pPr>
+    <w:r>
+      <w:fldChar w:fldCharType="begin"/>
+    </w:r>
+    <w:r>
+      <w:instrText>HYPERLINK "https://github.com/davidtiechman/SmartSales/tree/main" \h</w:instrText>
+    </w:r>
+    <w:r>
+      <w:fldChar w:fldCharType="separate"/>
+    </w:r>
+    <w:r>
+      <w:rPr>
+        <w:rStyle w:val="Hyperlink"/>
+        <w:b/>
+        <w:bCs/>
+        <w:sz w:val="18"/>
+        <w:szCs w:val="18"/>
+      </w:rPr>
+      <w:t>Smart Sales</w:t>
+    </w:r>
+    <w:r>
+      <w:fldChar w:fldCharType="end"/>
+    </w:r>
+    <w:r>
+      <w:rPr>
+        <w:color w:val="5B6573"/>
+        <w:sz w:val="18"/>
+        <w:szCs w:val="18"/>
+        <w:rtl/>
+      </w:rPr>
+      <w:t xml:space="preserve"> ספר פרויקט גמר</w:t>
+    </w:r>
   </w:p>
 </w:hdr>
 </file>
@@ -27874,6 +27917,12 @@
 
 <file path=word/header4.xml><?xml version="1.0" encoding="utf-8"?>
 <w:hdr xmlns:wpc="http://schemas.microsoft.com/office/word/2010/wordprocessingCanvas" xmlns:cx="http://schemas.microsoft.com/office/drawing/2014/chartex" xmlns:cx1="http://schemas.microsoft.com/office/drawing/2015/9/8/chartex" xmlns:cx2="http://schemas.microsoft.com/office/drawing/2015/10/21/chartex" xmlns:cx3="http://schemas.microsoft.com/office/drawing/2016/5/9/chartex" xmlns:cx4="http://schemas.microsoft.com/office/drawing/2016/5/10/chartex" xmlns:cx5="http://schemas.microsoft.com/office/drawing/2016/5/11/chartex" xmlns:cx6="http://schemas.microsoft.com/office/drawing/2016/5/12/chartex" xmlns:cx7="http://schemas.microsoft.com/office/drawing/2016/5/13/chartex" xmlns:cx8="http://schemas.microsoft.com/office/drawing/2016/5/14/chartex" xmlns:mc="http://schemas.openxmlformats.org/markup-compatibility/2006" xmlns:m="http://schemas.openxmlformats.org/officeDocument/2006/math" xmlns:aink="http://schemas.microsoft.com/office/drawing/2016/ink" xmlns:am3d="http://schemas.microsoft.com/office/drawing/2017/model3d" xmlns:oel="http://schemas.microsoft.com/office/2019/extlst" xmlns:r="http://schemas.openxmlformats.org/officeDocument/2006/relationships" xmlns:wp14="http://schemas.microsoft.com/office/word/2010/wordprocessingDrawing" xmlns:wp="http://schemas.openxmlformats.org/drawingml/2006/wordprocessingDrawing" xmlns:wpg="http://schemas.microsoft.com/office/word/2010/wordprocessingGroup" xmlns:wpi="http://schemas.microsoft.com/office/word/2010/wordprocessingInk" xmlns:wps="http://schemas.microsoft.com/office/word/2010/wordprocessingShape" xmlns:o="urn:schemas-microsoft-com:office:office" xmlns:v="urn:schemas-microsoft-com:vml" xmlns:w10="urn:schemas-microsoft-com:office:word" xmlns:w="http://schemas.openxmlformats.org/wordprocessingml/2006/main" xmlns:w14="http://schemas.microsoft.com/office/word/2010/wordml" xmlns:w15="http://schemas.microsoft.com/office/word/2012/wordml" xmlns:w16cex="http://schemas.microsoft.com/office/word/2018/wordml/cex" xmlns:w16cid="http://schemas.microsoft.com/office/word/2016/wordml/cid" xmlns:w16="http://schemas.microsoft.com/office/word/2018/wordml" xmlns:w16sdtdh="http://schemas.microsoft.com/office/word/2020/wordml/sdtdatahash" xmlns:w16sdtfl="http://schemas.microsoft.com/office/word/2024/wordml/sdtformatlock" xmlns:w16se="http://schemas.microsoft.com/office/word/2015/wordml/symex" xmlns:w16du="http://schemas.microsoft.com/office/word/2023/wordml/word16du" xmlns:wne="http://schemas.microsoft.com/office/word/2006/wordml" mc:Ignorable="w14 w15 w16se w16cid w16 w16cex w16sdtdh w16sdtfl w16du wp14">
+  <w:p/>
+</w:hdr>
+</file>
+
+<file path=word/header5.xml><?xml version="1.0" encoding="utf-8"?>
+<w:hdr xmlns:wpc="http://schemas.microsoft.com/office/word/2010/wordprocessingCanvas" xmlns:cx="http://schemas.microsoft.com/office/drawing/2014/chartex" xmlns:cx1="http://schemas.microsoft.com/office/drawing/2015/9/8/chartex" xmlns:cx2="http://schemas.microsoft.com/office/drawing/2015/10/21/chartex" xmlns:cx3="http://schemas.microsoft.com/office/drawing/2016/5/9/chartex" xmlns:cx4="http://schemas.microsoft.com/office/drawing/2016/5/10/chartex" xmlns:cx5="http://schemas.microsoft.com/office/drawing/2016/5/11/chartex" xmlns:cx6="http://schemas.microsoft.com/office/drawing/2016/5/12/chartex" xmlns:cx7="http://schemas.microsoft.com/office/drawing/2016/5/13/chartex" xmlns:cx8="http://schemas.microsoft.com/office/drawing/2016/5/14/chartex" xmlns:mc="http://schemas.openxmlformats.org/markup-compatibility/2006" xmlns:m="http://schemas.openxmlformats.org/officeDocument/2006/math" xmlns:aink="http://schemas.microsoft.com/office/drawing/2016/ink" xmlns:am3d="http://schemas.microsoft.com/office/drawing/2017/model3d" xmlns:oel="http://schemas.microsoft.com/office/2019/extlst" xmlns:r="http://schemas.openxmlformats.org/officeDocument/2006/relationships" xmlns:wp14="http://schemas.microsoft.com/office/word/2010/wordprocessingDrawing" xmlns:wp="http://schemas.openxmlformats.org/drawingml/2006/wordprocessingDrawing" xmlns:wpg="http://schemas.microsoft.com/office/word/2010/wordprocessingGroup" xmlns:wpi="http://schemas.microsoft.com/office/word/2010/wordprocessingInk" xmlns:wps="http://schemas.microsoft.com/office/word/2010/wordprocessingShape" xmlns:o="urn:schemas-microsoft-com:office:office" xmlns:v="urn:schemas-microsoft-com:vml" xmlns:w10="urn:schemas-microsoft-com:office:word" xmlns:w="http://schemas.openxmlformats.org/wordprocessingml/2006/main" xmlns:w14="http://schemas.microsoft.com/office/word/2010/wordml" xmlns:w15="http://schemas.microsoft.com/office/word/2012/wordml" xmlns:w16cex="http://schemas.microsoft.com/office/word/2018/wordml/cex" xmlns:w16cid="http://schemas.microsoft.com/office/word/2016/wordml/cid" xmlns:w16="http://schemas.microsoft.com/office/word/2018/wordml" xmlns:w16sdtdh="http://schemas.microsoft.com/office/word/2020/wordml/sdtdatahash" xmlns:w16sdtfl="http://schemas.microsoft.com/office/word/2024/wordml/sdtformatlock" xmlns:w16se="http://schemas.microsoft.com/office/word/2015/wordml/symex" xmlns:w16du="http://schemas.microsoft.com/office/word/2023/wordml/word16du" xmlns:wne="http://schemas.microsoft.com/office/word/2006/wordml" mc:Ignorable="w14 w15 w16se w16cid w16 w16cex w16sdtdh w16sdtfl w16du wp14">
   <w:p>
     <w:pPr>
       <w:pBdr>
@@ -27906,47 +27955,7 @@
 </w:hdr>
 </file>
 
-<file path=word/header5.xml><?xml version="1.0" encoding="utf-8"?>
-<w:hdr xmlns:wpc="http://schemas.microsoft.com/office/word/2010/wordprocessingCanvas" xmlns:cx="http://schemas.microsoft.com/office/drawing/2014/chartex" xmlns:cx1="http://schemas.microsoft.com/office/drawing/2015/9/8/chartex" xmlns:cx2="http://schemas.microsoft.com/office/drawing/2015/10/21/chartex" xmlns:cx3="http://schemas.microsoft.com/office/drawing/2016/5/9/chartex" xmlns:cx4="http://schemas.microsoft.com/office/drawing/2016/5/10/chartex" xmlns:cx5="http://schemas.microsoft.com/office/drawing/2016/5/11/chartex" xmlns:cx6="http://schemas.microsoft.com/office/drawing/2016/5/12/chartex" xmlns:cx7="http://schemas.microsoft.com/office/drawing/2016/5/13/chartex" xmlns:cx8="http://schemas.microsoft.com/office/drawing/2016/5/14/chartex" xmlns:mc="http://schemas.openxmlformats.org/markup-compatibility/2006" xmlns:m="http://schemas.openxmlformats.org/officeDocument/2006/math" xmlns:aink="http://schemas.microsoft.com/office/drawing/2016/ink" xmlns:am3d="http://schemas.microsoft.com/office/drawing/2017/model3d" xmlns:oel="http://schemas.microsoft.com/office/2019/extlst" xmlns:r="http://schemas.openxmlformats.org/officeDocument/2006/relationships" xmlns:wp14="http://schemas.microsoft.com/office/word/2010/wordprocessingDrawing" xmlns:wp="http://schemas.openxmlformats.org/drawingml/2006/wordprocessingDrawing" xmlns:wpg="http://schemas.microsoft.com/office/word/2010/wordprocessingGroup" xmlns:wpi="http://schemas.microsoft.com/office/word/2010/wordprocessingInk" xmlns:wps="http://schemas.microsoft.com/office/word/2010/wordprocessingShape" xmlns:o="urn:schemas-microsoft-com:office:office" xmlns:v="urn:schemas-microsoft-com:vml" xmlns:w10="urn:schemas-microsoft-com:office:word" xmlns:w="http://schemas.openxmlformats.org/wordprocessingml/2006/main" xmlns:w14="http://schemas.microsoft.com/office/word/2010/wordml" xmlns:w15="http://schemas.microsoft.com/office/word/2012/wordml" xmlns:w16cex="http://schemas.microsoft.com/office/word/2018/wordml/cex" xmlns:w16cid="http://schemas.microsoft.com/office/word/2016/wordml/cid" xmlns:w16="http://schemas.microsoft.com/office/word/2018/wordml" xmlns:w16sdtdh="http://schemas.microsoft.com/office/word/2020/wordml/sdtdatahash" xmlns:w16sdtfl="http://schemas.microsoft.com/office/word/2024/wordml/sdtformatlock" xmlns:w16se="http://schemas.microsoft.com/office/word/2015/wordml/symex" xmlns:w16du="http://schemas.microsoft.com/office/word/2023/wordml/word16du" xmlns:wne="http://schemas.microsoft.com/office/word/2006/wordml" mc:Ignorable="w14 w15 w16se w16cid w16 w16cex w16sdtdh w16sdtfl w16du wp14">
-  <w:p/>
-</w:hdr>
-</file>
-
 <file path=word/header6.xml><?xml version="1.0" encoding="utf-8"?>
-<w:hdr xmlns:wpc="http://schemas.microsoft.com/office/word/2010/wordprocessingCanvas" xmlns:cx="http://schemas.microsoft.com/office/drawing/2014/chartex" xmlns:cx1="http://schemas.microsoft.com/office/drawing/2015/9/8/chartex" xmlns:cx2="http://schemas.microsoft.com/office/drawing/2015/10/21/chartex" xmlns:cx3="http://schemas.microsoft.com/office/drawing/2016/5/9/chartex" xmlns:cx4="http://schemas.microsoft.com/office/drawing/2016/5/10/chartex" xmlns:cx5="http://schemas.microsoft.com/office/drawing/2016/5/11/chartex" xmlns:cx6="http://schemas.microsoft.com/office/drawing/2016/5/12/chartex" xmlns:cx7="http://schemas.microsoft.com/office/drawing/2016/5/13/chartex" xmlns:cx8="http://schemas.microsoft.com/office/drawing/2016/5/14/chartex" xmlns:mc="http://schemas.openxmlformats.org/markup-compatibility/2006" xmlns:m="http://schemas.openxmlformats.org/officeDocument/2006/math" xmlns:aink="http://schemas.microsoft.com/office/drawing/2016/ink" xmlns:am3d="http://schemas.microsoft.com/office/drawing/2017/model3d" xmlns:oel="http://schemas.microsoft.com/office/2019/extlst" xmlns:r="http://schemas.openxmlformats.org/officeDocument/2006/relationships" xmlns:wp14="http://schemas.microsoft.com/office/word/2010/wordprocessingDrawing" xmlns:wp="http://schemas.openxmlformats.org/drawingml/2006/wordprocessingDrawing" xmlns:wpg="http://schemas.microsoft.com/office/word/2010/wordprocessingGroup" xmlns:wpi="http://schemas.microsoft.com/office/word/2010/wordprocessingInk" xmlns:wps="http://schemas.microsoft.com/office/word/2010/wordprocessingShape" xmlns:o="urn:schemas-microsoft-com:office:office" xmlns:v="urn:schemas-microsoft-com:vml" xmlns:w10="urn:schemas-microsoft-com:office:word" xmlns:w="http://schemas.openxmlformats.org/wordprocessingml/2006/main" xmlns:w14="http://schemas.microsoft.com/office/word/2010/wordml" xmlns:w15="http://schemas.microsoft.com/office/word/2012/wordml" xmlns:w16cex="http://schemas.microsoft.com/office/word/2018/wordml/cex" xmlns:w16cid="http://schemas.microsoft.com/office/word/2016/wordml/cid" xmlns:w16="http://schemas.microsoft.com/office/word/2018/wordml" xmlns:w16sdtdh="http://schemas.microsoft.com/office/word/2020/wordml/sdtdatahash" xmlns:w16sdtfl="http://schemas.microsoft.com/office/word/2024/wordml/sdtformatlock" xmlns:w16se="http://schemas.microsoft.com/office/word/2015/wordml/symex" xmlns:w16du="http://schemas.microsoft.com/office/word/2023/wordml/word16du" xmlns:wne="http://schemas.microsoft.com/office/word/2006/wordml" mc:Ignorable="w14 w15 w16se w16cid w16 w16cex w16sdtdh w16sdtfl w16du wp14">
-  <w:p>
-    <w:pPr>
-      <w:pBdr>
-        <w:bottom w:val="single" w:sz="4" w:space="0" w:color="D7DEE7"/>
-      </w:pBdr>
-      <w:jc w:val="right"/>
-    </w:pPr>
-    <w:hyperlink r:id="rId1">
-      <w:r>
-        <w:rPr>
-          <w:rStyle w:val="Hyperlink"/>
-          <w:b/>
-          <w:bCs/>
-          <w:sz w:val="18"/>
-          <w:szCs w:val="18"/>
-        </w:rPr>
-        <w:t>Smart Sales</w:t>
-      </w:r>
-    </w:hyperlink>
-    <w:r>
-      <w:rPr>
-        <w:color w:val="5B6573"/>
-        <w:sz w:val="18"/>
-        <w:szCs w:val="18"/>
-        <w:rtl/>
-      </w:rPr>
-      <w:t xml:space="preserve"> ספר פרויקט גמר</w:t>
-    </w:r>
-  </w:p>
-</w:hdr>
-</file>
-
-<file path=word/header7.xml><?xml version="1.0" encoding="utf-8"?>
 <w:hdr xmlns:wpc="http://schemas.microsoft.com/office/word/2010/wordprocessingCanvas" xmlns:cx="http://schemas.microsoft.com/office/drawing/2014/chartex" xmlns:cx1="http://schemas.microsoft.com/office/drawing/2015/9/8/chartex" xmlns:cx2="http://schemas.microsoft.com/office/drawing/2015/10/21/chartex" xmlns:cx3="http://schemas.microsoft.com/office/drawing/2016/5/9/chartex" xmlns:cx4="http://schemas.microsoft.com/office/drawing/2016/5/10/chartex" xmlns:cx5="http://schemas.microsoft.com/office/drawing/2016/5/11/chartex" xmlns:cx6="http://schemas.microsoft.com/office/drawing/2016/5/12/chartex" xmlns:cx7="http://schemas.microsoft.com/office/drawing/2016/5/13/chartex" xmlns:cx8="http://schemas.microsoft.com/office/drawing/2016/5/14/chartex" xmlns:mc="http://schemas.openxmlformats.org/markup-compatibility/2006" xmlns:m="http://schemas.openxmlformats.org/officeDocument/2006/math" xmlns:aink="http://schemas.microsoft.com/office/drawing/2016/ink" xmlns:am3d="http://schemas.microsoft.com/office/drawing/2017/model3d" xmlns:oel="http://schemas.microsoft.com/office/2019/extlst" xmlns:r="http://schemas.openxmlformats.org/officeDocument/2006/relationships" xmlns:wp14="http://schemas.microsoft.com/office/word/2010/wordprocessingDrawing" xmlns:wp="http://schemas.openxmlformats.org/drawingml/2006/wordprocessingDrawing" xmlns:wpg="http://schemas.microsoft.com/office/word/2010/wordprocessingGroup" xmlns:wpi="http://schemas.microsoft.com/office/word/2010/wordprocessingInk" xmlns:wps="http://schemas.microsoft.com/office/word/2010/wordprocessingShape" xmlns:o="urn:schemas-microsoft-com:office:office" xmlns:v="urn:schemas-microsoft-com:vml" xmlns:w10="urn:schemas-microsoft-com:office:word" xmlns:w="http://schemas.openxmlformats.org/wordprocessingml/2006/main" xmlns:w14="http://schemas.microsoft.com/office/word/2010/wordml" xmlns:w15="http://schemas.microsoft.com/office/word/2012/wordml" xmlns:w16cex="http://schemas.microsoft.com/office/word/2018/wordml/cex" xmlns:w16cid="http://schemas.microsoft.com/office/word/2016/wordml/cid" xmlns:w16="http://schemas.microsoft.com/office/word/2018/wordml" xmlns:w16sdtdh="http://schemas.microsoft.com/office/word/2020/wordml/sdtdatahash" xmlns:w16sdtfl="http://schemas.microsoft.com/office/word/2024/wordml/sdtformatlock" xmlns:w16se="http://schemas.microsoft.com/office/word/2015/wordml/symex" xmlns:w16du="http://schemas.microsoft.com/office/word/2023/wordml/word16du" xmlns:wne="http://schemas.microsoft.com/office/word/2006/wordml" mc:Ignorable="w14 w15 w16se w16cid w16 w16cex w16sdtdh w16sdtfl w16du wp14">
   <w:p/>
 </w:hdr>

</xml_diff>